<commit_message>
docs: polish first exam deliverables
</commit_message>
<xml_diff>
--- a/docs/entregables/informe-primer-examen.docx
+++ b/docs/entregables/informe-primer-examen.docx
@@ -5,116 +5,13 @@
     <w:p>
       <w:pPr>
         <w:pStyle w:val="Title"/>
-        <w:jc w:val="center"/>
+        <w:jc w:val="left"/>
       </w:pPr>
       <w:r>
         <w:rPr>
           <w:rFonts w:ascii="Arial" w:hAnsi="Arial"/>
         </w:rPr>
-        <w:t>Sistema de gestión de préstamos de bienes de la EPCC</w:t>
-      </w:r>
-    </w:p>
-    <w:p>
-      <w:pPr>
-        <w:spacing w:after="520"/>
-        <w:jc w:val="center"/>
-      </w:pPr>
-      <w:r>
-        <w:rPr>
-          <w:rFonts w:ascii="Arial" w:hAnsi="Arial"/>
-          <w:color w:val="000000"/>
-          <w:sz w:val="32"/>
-        </w:rPr>
-        <w:t>Informe para el primer examen</w:t>
-      </w:r>
-    </w:p>
-    <w:p>
-      <w:pPr>
-        <w:spacing w:after="160"/>
-        <w:jc w:val="center"/>
-      </w:pPr>
-      <w:r>
-        <w:rPr>
-          <w:rFonts w:ascii="Arial" w:hAnsi="Arial"/>
-          <w:color w:val="1D2730"/>
-          <w:sz w:val="24"/>
-        </w:rPr>
-        <w:t>Universidad Nacional de San Agustín</w:t>
-      </w:r>
-    </w:p>
-    <w:p>
-      <w:pPr>
-        <w:spacing w:after="160"/>
-        <w:jc w:val="center"/>
-      </w:pPr>
-      <w:r>
-        <w:rPr>
-          <w:rFonts w:ascii="Arial" w:hAnsi="Arial"/>
-          <w:color w:val="1D2730"/>
-          <w:sz w:val="24"/>
-        </w:rPr>
-        <w:t>Escuela Profesional de Ciencia de la Computación</w:t>
-      </w:r>
-    </w:p>
-    <w:p>
-      <w:pPr>
-        <w:spacing w:after="120"/>
-        <w:jc w:val="center"/>
-      </w:pPr>
-      <w:r>
-        <w:rPr>
-          <w:rFonts w:ascii="Arial" w:hAnsi="Arial"/>
-          <w:color w:val="4C5B67"/>
-          <w:sz w:val="22"/>
-        </w:rPr>
-        <w:t>Estudiante: completar</w:t>
-      </w:r>
-    </w:p>
-    <w:p>
-      <w:pPr>
-        <w:spacing w:after="120"/>
-        <w:jc w:val="center"/>
-      </w:pPr>
-      <w:r>
-        <w:rPr>
-          <w:rFonts w:ascii="Arial" w:hAnsi="Arial"/>
-          <w:color w:val="4C5B67"/>
-          <w:sz w:val="22"/>
-        </w:rPr>
-        <w:t>Docente: completar</w:t>
-      </w:r>
-    </w:p>
-    <w:p>
-      <w:pPr>
-        <w:spacing w:after="120"/>
-        <w:jc w:val="center"/>
-      </w:pPr>
-      <w:r>
-        <w:rPr>
-          <w:rFonts w:ascii="Arial" w:hAnsi="Arial"/>
-          <w:color w:val="4C5B67"/>
-          <w:sz w:val="22"/>
-        </w:rPr>
-        <w:t>Curso: completar</w:t>
-      </w:r>
-    </w:p>
-    <w:p>
-      <w:pPr>
-        <w:spacing w:after="120"/>
-        <w:jc w:val="center"/>
-      </w:pPr>
-      <w:r>
-        <w:rPr>
-          <w:rFonts w:ascii="Arial" w:hAnsi="Arial"/>
-          <w:color w:val="4C5B67"/>
-          <w:sz w:val="22"/>
-        </w:rPr>
-        <w:t>Arequipa, 29 de septiembre de 2026</w:t>
-      </w:r>
-    </w:p>
-    <w:p>
-      <w:r>
-        <w:br w:type="page"/>
+        <w:t>Análisis y diseño inicial del sistema de préstamos de bienes EPCC</w:t>
       </w:r>
     </w:p>
     <w:p>
@@ -125,7 +22,7 @@
         <w:rPr>
           <w:rFonts w:ascii="Arial" w:hAnsi="Arial"/>
         </w:rPr>
-        <w:t>Resumen ejecutivo</w:t>
+        <w:t>Propósito y alcance</w:t>
       </w:r>
     </w:p>
     <w:p>
@@ -137,7 +34,7 @@
         <w:rPr>
           <w:rFonts w:ascii="Arial" w:hAnsi="Arial"/>
         </w:rPr>
-        <w:t>Este informe presenta la primera versión del análisis del Sistema de Gestión de Préstamos de Bienes de la EPCC. Atiende los tres productos solicitados para el primer examen: requisitos del sistema, modelo de dominio y extensión del modelo hacia una arquitectura en capas mediante diagramas UML [F1].</w:t>
+        <w:t>Este documento presenta los productos solicitados para el primer examen: requisitos, modelo de dominio y arquitectura en capas. Se elaboró a partir del diagrama conceptual, el esquema PostgreSQL y la documentación del repositorio. Se distingue el dominio completo del subconjunto que actualmente concreta el SQL.</w:t>
       </w:r>
     </w:p>
     <w:p>
@@ -149,7 +46,18 @@
         <w:rPr>
           <w:rFonts w:ascii="Arial" w:hAnsi="Arial"/>
         </w:rPr>
-        <w:t>El diseño considera personas y cuentas, inventario físico, reservas, préstamos y renovaciones. El esquema PostgreSQL suministrado cubre parcialmente identidad y acceso, y desarrolla inventario, reservas y préstamos; todavía no incorpora políticas de préstamo, vinculación académica, garantías, incidencias, sanciones ni auditoría [F3]. La arquitectura propuesta conserva los contextos del modelo dentro de una aplicación Python modular con API FastAPI y persistencia PostgreSQL.</w:t>
+        <w:t>El sistema busca administrar el catálogo de bienes y controlar las reservas, entregas, renovaciones y devoluciones realizadas por la comunidad de la Escuela Profesional de Ciencia de la Computación. El diseño se encuentra en etapa inicial: el repositorio dispone de una API de salud y PostgreSQL local, pero aún no integra persistencia de negocio ni los flujos funcionales.</w:t>
+      </w:r>
+    </w:p>
+    <w:p>
+      <w:pPr>
+        <w:pStyle w:val="Heading2"/>
+      </w:pPr>
+      <w:r>
+        <w:rPr>
+          <w:rFonts w:ascii="Arial" w:hAnsi="Arial"/>
+        </w:rPr>
+        <w:t>1. Requisitos del sistema</w:t>
       </w:r>
     </w:p>
     <w:p>
@@ -161,114 +69,33 @@
         <w:rPr>
           <w:rFonts w:ascii="Arial" w:hAnsi="Arial"/>
         </w:rPr>
-        <w:t>El repositorio contiene documentación inicial, un endpoint de salud y la configuración local de PostgreSQL. El esquema SQL y los diagramas de dominio aún no se han integrado en la aplicación; por tanto, este informe describe un diseño en elaboración y no una solución funcional completa [F4].</w:t>
+        <w:t xml:space="preserve">Los requisitos derivados del esquema se identifican como </w:t>
       </w:r>
-    </w:p>
-    <w:p>
-      <w:pPr>
-        <w:pStyle w:val="Heading2"/>
-      </w:pPr>
       <w:r>
         <w:rPr>
           <w:rFonts w:ascii="Arial" w:hAnsi="Arial"/>
+          <w:b/>
         </w:rPr>
-        <w:t>Introducción y alcance</w:t>
-      </w:r>
-    </w:p>
-    <w:p>
-      <w:pPr>
-        <w:widowControl/>
-        <w:jc w:val="left"/>
-      </w:pPr>
-      <w:r>
-        <w:rPr>
-          <w:rFonts w:ascii="Arial" w:hAnsi="Arial"/>
-        </w:rPr>
-        <w:t>El sistema busca controlar la identificación de bienes prestables y el ciclo de reserva, entrega, renovación y devolución. Cada operación debe relacionar a las personas involucradas con una unidad física concreta, registrar sus fechas y conservar el estado del bien.</w:t>
-      </w:r>
-    </w:p>
-    <w:p>
-      <w:pPr>
-        <w:widowControl/>
-        <w:jc w:val="left"/>
-      </w:pPr>
-      <w:r>
-        <w:rPr>
-          <w:rFonts w:ascii="Arial" w:hAnsi="Arial"/>
-        </w:rPr>
-        <w:t>Para el examen se presenta el diseño general. El alcance examinado se basa en el modelo de dominio entregado y en el SQL adjunto. Los requisitos derivados de ese material se distinguen de las recomendaciones que todavía necesitan validación con los responsables de la EPCC.</w:t>
-      </w:r>
-    </w:p>
-    <w:p>
-      <w:pPr>
-        <w:pStyle w:val="Heading2"/>
-      </w:pPr>
-      <w:r>
-        <w:rPr>
-          <w:rFonts w:ascii="Arial" w:hAnsi="Arial"/>
-        </w:rPr>
-        <w:t>Fuentes y estado del proyecto</w:t>
-      </w:r>
-    </w:p>
-    <w:p>
-      <w:pPr>
-        <w:widowControl/>
-        <w:jc w:val="left"/>
-      </w:pPr>
-      <w:r>
-        <w:rPr>
-          <w:rFonts w:ascii="Arial" w:hAnsi="Arial"/>
-        </w:rPr>
-        <w:t>La pauta del examen pide requisitos, el modelo de dominio y una arquitectura en capas con diagramas UML de paquetes y clases [F1]. El diagrama de dominio compartido organiza el problema en contextos delimitados. El archivo SQL concreta cuatro de ellos: BC-01 Identidad y Acceso de forma parcial, BC-03 Catálogo e Inventario, BC-05 Reservas y BC-06 Préstamos [F2, F3].</w:t>
-      </w:r>
-    </w:p>
-    <w:p>
-      <w:pPr>
-        <w:widowControl/>
-        <w:jc w:val="left"/>
-      </w:pPr>
-      <w:r>
-        <w:rPr>
-          <w:rFonts w:ascii="Arial" w:hAnsi="Arial"/>
-        </w:rPr>
-        <w:t xml:space="preserve">La propuesta tecnológica existente selecciona Python, FastAPI, SQLAlchemy, Alembic y PostgreSQL para una primera implementación como monolito modular. El repositorio también incluye un endpoint </w:t>
-      </w:r>
-      <w:r>
-        <w:rPr>
-          <w:rFonts w:ascii="Menlo" w:hAnsi="Menlo"/>
-          <w:color w:val="245B84"/>
-          <w:sz w:val="18"/>
-        </w:rPr>
-        <w:t>/health</w:t>
+        <w:t>D</w:t>
       </w:r>
       <w:r>
         <w:rPr>
           <w:rFonts w:ascii="Arial" w:hAnsi="Arial"/>
         </w:rPr>
-        <w:t xml:space="preserve"> y un servicio PostgreSQL en Docker Compose. A la fecha de este informe no hay modelos de persistencia, migraciones, autenticación, operaciones de inventario, reservas o préstamos integradas en la aplicación [F4].</w:t>
+        <w:t xml:space="preserve">; los que requieren confirmar reglas operativas con la EPCC, como </w:t>
       </w:r>
-    </w:p>
-    <w:p>
-      <w:pPr>
-        <w:pStyle w:val="Heading2"/>
-      </w:pPr>
+      <w:r>
+        <w:rPr>
+          <w:rFonts w:ascii="Arial" w:hAnsi="Arial"/>
+          <w:b/>
+        </w:rPr>
+        <w:t>V</w:t>
+      </w:r>
       <w:r>
         <w:rPr>
           <w:rFonts w:ascii="Arial" w:hAnsi="Arial"/>
         </w:rPr>
-        <w:t>Requisitos del sistema</w:t>
-      </w:r>
-    </w:p>
-    <w:p>
-      <w:pPr>
-        <w:widowControl/>
-        <w:jc w:val="left"/>
-      </w:pPr>
-      <w:r>
-        <w:rPr>
-          <w:rFonts w:ascii="Arial" w:hAnsi="Arial"/>
-        </w:rPr>
-        <w:t>Los requisitos marcados como derivados se observan directamente en las tablas, restricciones o estados del SQL. Los marcados como por validar completan el flujo del producto o vienen de la documentación funcional, pero necesitan aprobación de la EPCC antes de considerarse definitivos.</w:t>
+        <w:t>. Esta distinción evita presentar decisiones pendientes como políticas institucionales aprobadas.</w:t>
       </w:r>
     </w:p>
     <w:p>
@@ -385,7 +212,7 @@
                 <w:color w:val="FFFFFF"/>
                 <w:sz w:val="17"/>
               </w:rPr>
-              <w:t>Origen y estado</w:t>
+              <w:t>Estado</w:t>
             </w:r>
           </w:p>
         </w:tc>
@@ -441,7 +268,7 @@
                 <w:color w:val="1D2730"/>
                 <w:sz w:val="17"/>
               </w:rPr>
-              <w:t>Registrar personas con CUI, documento, nombre, correo institucional, rol base, vinculación y estado.</w:t>
+              <w:t>Registrar personas y sus cuentas de acceso, identificadores, estado y rol base.</w:t>
             </w:r>
           </w:p>
         </w:tc>
@@ -466,7 +293,7 @@
                 <w:color w:val="1D2730"/>
                 <w:sz w:val="17"/>
               </w:rPr>
-              <w:t>SQL; derivado</w:t>
+              <w:t>D</w:t>
             </w:r>
           </w:p>
         </w:tc>
@@ -524,7 +351,7 @@
                 <w:color w:val="1D2730"/>
                 <w:sz w:val="17"/>
               </w:rPr>
-              <w:t>Asociar a una persona una cuenta con nombre de usuario, hash de contraseña, estado y último acceso.</w:t>
+              <w:t>Organizar el catálogo en categorías, tipos, fichas y unidades físicas identificables.</w:t>
             </w:r>
           </w:p>
         </w:tc>
@@ -550,7 +377,7 @@
                 <w:color w:val="1D2730"/>
                 <w:sz w:val="17"/>
               </w:rPr>
-              <w:t>SQL; derivado</w:t>
+              <w:t>D</w:t>
             </w:r>
           </w:p>
         </w:tc>
@@ -606,7 +433,7 @@
                 <w:color w:val="1D2730"/>
                 <w:sz w:val="17"/>
               </w:rPr>
-              <w:t>Mantener categorías y tipos de bien, indicando si cada tipo se puede prestar.</w:t>
+              <w:t>Solicitar y gestionar reservas de bienes para un intervalo, registrando solicitante y uso previsto.</w:t>
             </w:r>
           </w:p>
         </w:tc>
@@ -631,7 +458,7 @@
                 <w:color w:val="1D2730"/>
                 <w:sz w:val="17"/>
               </w:rPr>
-              <w:t>SQL; derivado</w:t>
+              <w:t>D/V</w:t>
             </w:r>
           </w:p>
         </w:tc>
@@ -689,7 +516,7 @@
                 <w:color w:val="1D2730"/>
                 <w:sz w:val="17"/>
               </w:rPr>
-              <w:t>Mantener fichas de bienes y unidades físicas con código de inventario, ubicación, condición, accesorios y estado.</w:t>
+              <w:t>Registrar préstamos, responsables, unidad, plazo y reserva de origen cuando corresponda.</w:t>
             </w:r>
           </w:p>
         </w:tc>
@@ -715,7 +542,7 @@
                 <w:color w:val="1D2730"/>
                 <w:sz w:val="17"/>
               </w:rPr>
-              <w:t>SQL; derivado</w:t>
+              <w:t>D</w:t>
             </w:r>
           </w:p>
         </w:tc>
@@ -771,7 +598,7 @@
                 <w:color w:val="1D2730"/>
                 <w:sz w:val="17"/>
               </w:rPr>
-              <w:t>Solicitar una reserva para una unidad durante un intervalo, registrando solicitante y uso previsto.</w:t>
+              <w:t>Registrar evidencia de entrega, devolución y condición del bien.</w:t>
             </w:r>
           </w:p>
         </w:tc>
@@ -796,7 +623,7 @@
                 <w:color w:val="1D2730"/>
                 <w:sz w:val="17"/>
               </w:rPr>
-              <w:t>SQL; derivado</w:t>
+              <w:t>D</w:t>
             </w:r>
           </w:p>
         </w:tc>
@@ -854,7 +681,7 @@
                 <w:color w:val="1D2730"/>
                 <w:sz w:val="17"/>
               </w:rPr>
-              <w:t>Cambiar el estado de una reserva y guardar el motivo cuando se rechace.</w:t>
+              <w:t>Registrar renovaciones autorizadas y su secuencia de vencimientos.</w:t>
             </w:r>
           </w:p>
         </w:tc>
@@ -880,7 +707,7 @@
                 <w:color w:val="1D2730"/>
                 <w:sz w:val="17"/>
               </w:rPr>
-              <w:t>SQL; el flujo de aprobación requiere validar reglas</w:t>
+              <w:t>D</w:t>
             </w:r>
           </w:p>
         </w:tc>
@@ -936,7 +763,7 @@
                 <w:color w:val="1D2730"/>
                 <w:sz w:val="17"/>
               </w:rPr>
-              <w:t>Registrar un préstamo con solicitante, administrador, unidad, plazo y reserva de origen opcional.</w:t>
+              <w:t>Consultar disponibilidad, historial y operaciones por persona, bien, estado y fechas.</w:t>
             </w:r>
           </w:p>
         </w:tc>
@@ -961,7 +788,7 @@
                 <w:color w:val="1D2730"/>
                 <w:sz w:val="17"/>
               </w:rPr>
-              <w:t>SQL; derivado</w:t>
+              <w:t>V</w:t>
             </w:r>
           </w:p>
         </w:tc>
@@ -1019,7 +846,7 @@
                 <w:color w:val="1D2730"/>
                 <w:sz w:val="17"/>
               </w:rPr>
-              <w:t>Registrar la entrega y la devolución, incluidos fecha, condición, accesorios, responsable y estado de destino de la unidad.</w:t>
+              <w:t>Conservar trazabilidad de las operaciones críticas y de sus responsables.</w:t>
             </w:r>
           </w:p>
         </w:tc>
@@ -1045,253 +872,7 @@
                 <w:color w:val="1D2730"/>
                 <w:sz w:val="17"/>
               </w:rPr>
-              <w:t>SQL; derivado</w:t>
-            </w:r>
-          </w:p>
-        </w:tc>
-      </w:tr>
-      <w:tr>
-        <w:trPr>
-          <w:cantSplit/>
-        </w:trPr>
-        <w:tc>
-          <w:tcPr>
-            <w:tcW w:type="dxa" w:w="1037"/>
-            <w:vAlign w:val="center"/>
-            <w:tcMar>
-              <w:top w:w="110" w:type="dxa"/>
-              <w:start w:w="110" w:type="dxa"/>
-              <w:bottom w:w="110" w:type="dxa"/>
-              <w:end w:w="110" w:type="dxa"/>
-            </w:tcMar>
-          </w:tcPr>
-          <w:p>
-            <w:pPr>
-              <w:spacing w:after="20" w:line="247" w:lineRule="auto"/>
-              <w:jc w:val="center"/>
-            </w:pPr>
-            <w:r>
-              <w:rPr>
-                <w:rFonts w:ascii="Arial" w:hAnsi="Arial"/>
-                <w:color w:val="1D2730"/>
-                <w:sz w:val="17"/>
-              </w:rPr>
-              <w:t>RF-09</w:t>
-            </w:r>
-          </w:p>
-        </w:tc>
-        <w:tc>
-          <w:tcPr>
-            <w:tcW w:type="dxa" w:w="6019"/>
-            <w:vAlign w:val="center"/>
-            <w:tcMar>
-              <w:top w:w="110" w:type="dxa"/>
-              <w:start w:w="110" w:type="dxa"/>
-              <w:bottom w:w="110" w:type="dxa"/>
-              <w:end w:w="110" w:type="dxa"/>
-            </w:tcMar>
-          </w:tcPr>
-          <w:p>
-            <w:pPr>
-              <w:spacing w:after="20" w:line="247" w:lineRule="auto"/>
-            </w:pPr>
-            <w:r>
-              <w:rPr>
-                <w:rFonts w:ascii="Arial" w:hAnsi="Arial"/>
-                <w:color w:val="1D2730"/>
-                <w:sz w:val="17"/>
-              </w:rPr>
-              <w:t>Registrar renovaciones con secuencia, vencimiento anterior y nuevo, administrador y fecha de autorización.</w:t>
-            </w:r>
-          </w:p>
-        </w:tc>
-        <w:tc>
-          <w:tcPr>
-            <w:tcW w:type="dxa" w:w="2822"/>
-            <w:vAlign w:val="center"/>
-            <w:tcMar>
-              <w:top w:w="110" w:type="dxa"/>
-              <w:start w:w="110" w:type="dxa"/>
-              <w:bottom w:w="110" w:type="dxa"/>
-              <w:end w:w="110" w:type="dxa"/>
-            </w:tcMar>
-          </w:tcPr>
-          <w:p>
-            <w:pPr>
-              <w:spacing w:after="20" w:line="247" w:lineRule="auto"/>
-            </w:pPr>
-            <w:r>
-              <w:rPr>
-                <w:rFonts w:ascii="Arial" w:hAnsi="Arial"/>
-                <w:color w:val="1D2730"/>
-                <w:sz w:val="17"/>
-              </w:rPr>
-              <w:t>SQL; derivado</w:t>
-            </w:r>
-          </w:p>
-        </w:tc>
-      </w:tr>
-      <w:tr>
-        <w:trPr>
-          <w:cantSplit/>
-        </w:trPr>
-        <w:tc>
-          <w:tcPr>
-            <w:tcW w:type="dxa" w:w="1037"/>
-            <w:vAlign w:val="center"/>
-            <w:tcMar>
-              <w:top w:w="110" w:type="dxa"/>
-              <w:start w:w="110" w:type="dxa"/>
-              <w:bottom w:w="110" w:type="dxa"/>
-              <w:end w:w="110" w:type="dxa"/>
-            </w:tcMar>
-            <w:shd w:fill="EAF1F7"/>
-          </w:tcPr>
-          <w:p>
-            <w:pPr>
-              <w:spacing w:after="20" w:line="247" w:lineRule="auto"/>
-              <w:jc w:val="center"/>
-            </w:pPr>
-            <w:r>
-              <w:rPr>
-                <w:rFonts w:ascii="Arial" w:hAnsi="Arial"/>
-                <w:color w:val="1D2730"/>
-                <w:sz w:val="17"/>
-              </w:rPr>
-              <w:t>RF-10</w:t>
-            </w:r>
-          </w:p>
-        </w:tc>
-        <w:tc>
-          <w:tcPr>
-            <w:tcW w:type="dxa" w:w="6019"/>
-            <w:vAlign w:val="center"/>
-            <w:tcMar>
-              <w:top w:w="110" w:type="dxa"/>
-              <w:start w:w="110" w:type="dxa"/>
-              <w:bottom w:w="110" w:type="dxa"/>
-              <w:end w:w="110" w:type="dxa"/>
-            </w:tcMar>
-            <w:shd w:fill="EAF1F7"/>
-          </w:tcPr>
-          <w:p>
-            <w:pPr>
-              <w:spacing w:after="20" w:line="247" w:lineRule="auto"/>
-            </w:pPr>
-            <w:r>
-              <w:rPr>
-                <w:rFonts w:ascii="Arial" w:hAnsi="Arial"/>
-                <w:color w:val="1D2730"/>
-                <w:sz w:val="17"/>
-              </w:rPr>
-              <w:t>Consultar personas, disponibilidad, reservas y préstamos por identificador, estado y fechas.</w:t>
-            </w:r>
-          </w:p>
-        </w:tc>
-        <w:tc>
-          <w:tcPr>
-            <w:tcW w:type="dxa" w:w="2822"/>
-            <w:vAlign w:val="center"/>
-            <w:tcMar>
-              <w:top w:w="110" w:type="dxa"/>
-              <w:start w:w="110" w:type="dxa"/>
-              <w:bottom w:w="110" w:type="dxa"/>
-              <w:end w:w="110" w:type="dxa"/>
-            </w:tcMar>
-            <w:shd w:fill="EAF1F7"/>
-          </w:tcPr>
-          <w:p>
-            <w:pPr>
-              <w:spacing w:after="20" w:line="247" w:lineRule="auto"/>
-            </w:pPr>
-            <w:r>
-              <w:rPr>
-                <w:rFonts w:ascii="Arial" w:hAnsi="Arial"/>
-                <w:color w:val="1D2730"/>
-                <w:sz w:val="17"/>
-              </w:rPr>
-              <w:t>Propuesto; validar filtros y permisos</w:t>
-            </w:r>
-          </w:p>
-        </w:tc>
-      </w:tr>
-      <w:tr>
-        <w:trPr>
-          <w:cantSplit/>
-        </w:trPr>
-        <w:tc>
-          <w:tcPr>
-            <w:tcW w:type="dxa" w:w="1037"/>
-            <w:vAlign w:val="center"/>
-            <w:tcMar>
-              <w:top w:w="110" w:type="dxa"/>
-              <w:start w:w="110" w:type="dxa"/>
-              <w:bottom w:w="110" w:type="dxa"/>
-              <w:end w:w="110" w:type="dxa"/>
-            </w:tcMar>
-          </w:tcPr>
-          <w:p>
-            <w:pPr>
-              <w:spacing w:after="20" w:line="247" w:lineRule="auto"/>
-              <w:jc w:val="center"/>
-            </w:pPr>
-            <w:r>
-              <w:rPr>
-                <w:rFonts w:ascii="Arial" w:hAnsi="Arial"/>
-                <w:color w:val="1D2730"/>
-                <w:sz w:val="17"/>
-              </w:rPr>
-              <w:t>RF-11</w:t>
-            </w:r>
-          </w:p>
-        </w:tc>
-        <w:tc>
-          <w:tcPr>
-            <w:tcW w:type="dxa" w:w="6019"/>
-            <w:vAlign w:val="center"/>
-            <w:tcMar>
-              <w:top w:w="110" w:type="dxa"/>
-              <w:start w:w="110" w:type="dxa"/>
-              <w:bottom w:w="110" w:type="dxa"/>
-              <w:end w:w="110" w:type="dxa"/>
-            </w:tcMar>
-          </w:tcPr>
-          <w:p>
-            <w:pPr>
-              <w:spacing w:after="20" w:line="247" w:lineRule="auto"/>
-            </w:pPr>
-            <w:r>
-              <w:rPr>
-                <w:rFonts w:ascii="Arial" w:hAnsi="Arial"/>
-                <w:color w:val="1D2730"/>
-                <w:sz w:val="17"/>
-              </w:rPr>
-              <w:t>Consultar el historial de cambios de las operaciones críticas.</w:t>
-            </w:r>
-          </w:p>
-        </w:tc>
-        <w:tc>
-          <w:tcPr>
-            <w:tcW w:type="dxa" w:w="2822"/>
-            <w:vAlign w:val="center"/>
-            <w:tcMar>
-              <w:top w:w="110" w:type="dxa"/>
-              <w:start w:w="110" w:type="dxa"/>
-              <w:bottom w:w="110" w:type="dxa"/>
-              <w:end w:w="110" w:type="dxa"/>
-            </w:tcMar>
-          </w:tcPr>
-          <w:p>
-            <w:pPr>
-              <w:spacing w:after="20" w:line="247" w:lineRule="auto"/>
-            </w:pPr>
-            <w:r>
-              <w:rPr>
-                <w:rFonts w:ascii="Arial" w:hAnsi="Arial"/>
-                <w:color w:val="1D2730"/>
-                <w:sz w:val="17"/>
-              </w:rPr>
-              <w:t>Documentación del proyecto; falta definir el modelo de auditoría</w:t>
+              <w:t>V</w:t>
             </w:r>
           </w:p>
         </w:tc>
@@ -1310,836 +891,102 @@
         <w:rPr>
           <w:rFonts w:ascii="Arial" w:hAnsi="Arial"/>
         </w:rPr>
-        <w:t>Requisitos no funcionales</w:t>
+        <w:t>Requisitos de calidad</w:t>
       </w:r>
-    </w:p>
-    <w:tbl>
-      <w:tblPr>
-        <w:tblW w:type="auto" w:w="0"/>
-        <w:jc w:val="center"/>
-        <w:tblLayout w:type="fixed"/>
-        <w:tblLook w:firstColumn="1" w:firstRow="1" w:lastColumn="0" w:lastRow="0" w:noHBand="0" w:noVBand="1" w:val="04A0"/>
-        <w:tblBorders>
-          <w:top w:val="single" w:sz="5" w:space="0" w:color="D4DCE3"/>
-          <w:left w:val="single" w:sz="5" w:space="0" w:color="D4DCE3"/>
-          <w:bottom w:val="single" w:sz="5" w:space="0" w:color="D4DCE3"/>
-          <w:right w:val="single" w:sz="5" w:space="0" w:color="D4DCE3"/>
-          <w:insideH w:val="single" w:sz="5" w:space="0" w:color="D4DCE3"/>
-          <w:insideV w:val="single" w:sz="5" w:space="0" w:color="D4DCE3"/>
-        </w:tblBorders>
-      </w:tblPr>
-      <w:tblGrid>
-        <w:gridCol w:w="3293"/>
-        <w:gridCol w:w="3293"/>
-        <w:gridCol w:w="3293"/>
-      </w:tblGrid>
-      <w:tr>
-        <w:trPr>
-          <w:tblHeader w:val="true"/>
-          <w:cantSplit/>
-        </w:trPr>
-        <w:tc>
-          <w:tcPr>
-            <w:tcW w:type="dxa" w:w="1037"/>
-            <w:vAlign w:val="center"/>
-            <w:tcMar>
-              <w:top w:w="110" w:type="dxa"/>
-              <w:start w:w="110" w:type="dxa"/>
-              <w:bottom w:w="110" w:type="dxa"/>
-              <w:end w:w="110" w:type="dxa"/>
-            </w:tcMar>
-            <w:shd w:fill="17324D"/>
-          </w:tcPr>
-          <w:p>
-            <w:pPr>
-              <w:spacing w:after="20" w:line="247" w:lineRule="auto"/>
-              <w:jc w:val="center"/>
-            </w:pPr>
-            <w:r>
-              <w:rPr>
-                <w:rFonts w:ascii="Arial" w:hAnsi="Arial"/>
-                <w:b/>
-                <w:color w:val="FFFFFF"/>
-                <w:sz w:val="17"/>
-              </w:rPr>
-              <w:t>ID</w:t>
-            </w:r>
-          </w:p>
-        </w:tc>
-        <w:tc>
-          <w:tcPr>
-            <w:tcW w:type="dxa" w:w="6019"/>
-            <w:vAlign w:val="center"/>
-            <w:tcMar>
-              <w:top w:w="110" w:type="dxa"/>
-              <w:start w:w="110" w:type="dxa"/>
-              <w:bottom w:w="110" w:type="dxa"/>
-              <w:end w:w="110" w:type="dxa"/>
-            </w:tcMar>
-            <w:shd w:fill="17324D"/>
-          </w:tcPr>
-          <w:p>
-            <w:pPr>
-              <w:spacing w:after="20" w:line="247" w:lineRule="auto"/>
-            </w:pPr>
-            <w:r>
-              <w:rPr>
-                <w:rFonts w:ascii="Arial" w:hAnsi="Arial"/>
-                <w:b/>
-                <w:color w:val="FFFFFF"/>
-                <w:sz w:val="17"/>
-              </w:rPr>
-              <w:t>Requisito</w:t>
-            </w:r>
-          </w:p>
-        </w:tc>
-        <w:tc>
-          <w:tcPr>
-            <w:tcW w:type="dxa" w:w="2822"/>
-            <w:vAlign w:val="center"/>
-            <w:tcMar>
-              <w:top w:w="110" w:type="dxa"/>
-              <w:start w:w="110" w:type="dxa"/>
-              <w:bottom w:w="110" w:type="dxa"/>
-              <w:end w:w="110" w:type="dxa"/>
-            </w:tcMar>
-            <w:shd w:fill="17324D"/>
-          </w:tcPr>
-          <w:p>
-            <w:pPr>
-              <w:spacing w:after="20" w:line="247" w:lineRule="auto"/>
-            </w:pPr>
-            <w:r>
-              <w:rPr>
-                <w:rFonts w:ascii="Arial" w:hAnsi="Arial"/>
-                <w:b/>
-                <w:color w:val="FFFFFF"/>
-                <w:sz w:val="17"/>
-              </w:rPr>
-              <w:t>Base de diseño</w:t>
-            </w:r>
-          </w:p>
-        </w:tc>
-      </w:tr>
-      <w:tr>
-        <w:trPr>
-          <w:cantSplit/>
-        </w:trPr>
-        <w:tc>
-          <w:tcPr>
-            <w:tcW w:type="dxa" w:w="1037"/>
-            <w:vAlign w:val="center"/>
-            <w:tcMar>
-              <w:top w:w="110" w:type="dxa"/>
-              <w:start w:w="110" w:type="dxa"/>
-              <w:bottom w:w="110" w:type="dxa"/>
-              <w:end w:w="110" w:type="dxa"/>
-            </w:tcMar>
-          </w:tcPr>
-          <w:p>
-            <w:pPr>
-              <w:spacing w:after="20" w:line="247" w:lineRule="auto"/>
-              <w:jc w:val="center"/>
-            </w:pPr>
-            <w:r>
-              <w:rPr>
-                <w:rFonts w:ascii="Arial" w:hAnsi="Arial"/>
-                <w:color w:val="1D2730"/>
-                <w:sz w:val="17"/>
-              </w:rPr>
-              <w:t>RNF-01</w:t>
-            </w:r>
-          </w:p>
-        </w:tc>
-        <w:tc>
-          <w:tcPr>
-            <w:tcW w:type="dxa" w:w="6019"/>
-            <w:vAlign w:val="center"/>
-            <w:tcMar>
-              <w:top w:w="110" w:type="dxa"/>
-              <w:start w:w="110" w:type="dxa"/>
-              <w:bottom w:w="110" w:type="dxa"/>
-              <w:end w:w="110" w:type="dxa"/>
-            </w:tcMar>
-          </w:tcPr>
-          <w:p>
-            <w:pPr>
-              <w:spacing w:after="20" w:line="247" w:lineRule="auto"/>
-            </w:pPr>
-            <w:r>
-              <w:rPr>
-                <w:rFonts w:ascii="Arial" w:hAnsi="Arial"/>
-                <w:color w:val="1D2730"/>
-                <w:sz w:val="17"/>
-              </w:rPr>
-              <w:t>La base de datos debe conservar identificadores únicos y relaciones válidas entre persona, cuenta, bien, reserva, préstamo y renovación.</w:t>
-            </w:r>
-          </w:p>
-        </w:tc>
-        <w:tc>
-          <w:tcPr>
-            <w:tcW w:type="dxa" w:w="2822"/>
-            <w:vAlign w:val="center"/>
-            <w:tcMar>
-              <w:top w:w="110" w:type="dxa"/>
-              <w:start w:w="110" w:type="dxa"/>
-              <w:bottom w:w="110" w:type="dxa"/>
-              <w:end w:w="110" w:type="dxa"/>
-            </w:tcMar>
-          </w:tcPr>
-          <w:p>
-            <w:pPr>
-              <w:spacing w:after="20" w:line="247" w:lineRule="auto"/>
-            </w:pPr>
-            <w:r>
-              <w:rPr>
-                <w:rFonts w:ascii="Arial" w:hAnsi="Arial"/>
-                <w:color w:val="1D2730"/>
-                <w:sz w:val="17"/>
-              </w:rPr>
-              <w:t>UUID, claves únicas y claves foráneas en SQL</w:t>
-            </w:r>
-          </w:p>
-        </w:tc>
-      </w:tr>
-      <w:tr>
-        <w:trPr>
-          <w:cantSplit/>
-        </w:trPr>
-        <w:tc>
-          <w:tcPr>
-            <w:tcW w:type="dxa" w:w="1037"/>
-            <w:vAlign w:val="center"/>
-            <w:tcMar>
-              <w:top w:w="110" w:type="dxa"/>
-              <w:start w:w="110" w:type="dxa"/>
-              <w:bottom w:w="110" w:type="dxa"/>
-              <w:end w:w="110" w:type="dxa"/>
-            </w:tcMar>
-            <w:shd w:fill="EAF1F7"/>
-          </w:tcPr>
-          <w:p>
-            <w:pPr>
-              <w:spacing w:after="20" w:line="247" w:lineRule="auto"/>
-              <w:jc w:val="center"/>
-            </w:pPr>
-            <w:r>
-              <w:rPr>
-                <w:rFonts w:ascii="Arial" w:hAnsi="Arial"/>
-                <w:color w:val="1D2730"/>
-                <w:sz w:val="17"/>
-              </w:rPr>
-              <w:t>RNF-02</w:t>
-            </w:r>
-          </w:p>
-        </w:tc>
-        <w:tc>
-          <w:tcPr>
-            <w:tcW w:type="dxa" w:w="6019"/>
-            <w:vAlign w:val="center"/>
-            <w:tcMar>
-              <w:top w:w="110" w:type="dxa"/>
-              <w:start w:w="110" w:type="dxa"/>
-              <w:bottom w:w="110" w:type="dxa"/>
-              <w:end w:w="110" w:type="dxa"/>
-            </w:tcMar>
-            <w:shd w:fill="EAF1F7"/>
-          </w:tcPr>
-          <w:p>
-            <w:pPr>
-              <w:spacing w:after="20" w:line="247" w:lineRule="auto"/>
-            </w:pPr>
-            <w:r>
-              <w:rPr>
-                <w:rFonts w:ascii="Arial" w:hAnsi="Arial"/>
-                <w:color w:val="1D2730"/>
-                <w:sz w:val="17"/>
-              </w:rPr>
-              <w:t>El sistema debe rechazar intervalos de reserva y plazos de préstamo inválidos.</w:t>
-            </w:r>
-          </w:p>
-        </w:tc>
-        <w:tc>
-          <w:tcPr>
-            <w:tcW w:type="dxa" w:w="2822"/>
-            <w:vAlign w:val="center"/>
-            <w:tcMar>
-              <w:top w:w="110" w:type="dxa"/>
-              <w:start w:w="110" w:type="dxa"/>
-              <w:bottom w:w="110" w:type="dxa"/>
-              <w:end w:w="110" w:type="dxa"/>
-            </w:tcMar>
-            <w:shd w:fill="EAF1F7"/>
-          </w:tcPr>
-          <w:p>
-            <w:pPr>
-              <w:spacing w:after="20" w:line="247" w:lineRule="auto"/>
-            </w:pPr>
-            <w:r>
-              <w:rPr>
-                <w:rFonts w:ascii="Arial" w:hAnsi="Arial"/>
-                <w:color w:val="1D2730"/>
-                <w:sz w:val="17"/>
-              </w:rPr>
-              <w:t xml:space="preserve">Restricciones </w:t>
-            </w:r>
-            <w:r>
-              <w:rPr>
-                <w:rFonts w:ascii="Arial" w:hAnsi="Arial"/>
-                <w:color w:val="1D2730"/>
-                <w:sz w:val="17"/>
-              </w:rPr>
-              <w:t>CHECK</w:t>
-            </w:r>
-            <w:r>
-              <w:rPr>
-                <w:rFonts w:ascii="Arial" w:hAnsi="Arial"/>
-                <w:color w:val="1D2730"/>
-                <w:sz w:val="17"/>
-              </w:rPr>
-              <w:t xml:space="preserve"> del esquema</w:t>
-            </w:r>
-          </w:p>
-        </w:tc>
-      </w:tr>
-      <w:tr>
-        <w:trPr>
-          <w:cantSplit/>
-        </w:trPr>
-        <w:tc>
-          <w:tcPr>
-            <w:tcW w:type="dxa" w:w="1037"/>
-            <w:vAlign w:val="center"/>
-            <w:tcMar>
-              <w:top w:w="110" w:type="dxa"/>
-              <w:start w:w="110" w:type="dxa"/>
-              <w:bottom w:w="110" w:type="dxa"/>
-              <w:end w:w="110" w:type="dxa"/>
-            </w:tcMar>
-          </w:tcPr>
-          <w:p>
-            <w:pPr>
-              <w:spacing w:after="20" w:line="247" w:lineRule="auto"/>
-              <w:jc w:val="center"/>
-            </w:pPr>
-            <w:r>
-              <w:rPr>
-                <w:rFonts w:ascii="Arial" w:hAnsi="Arial"/>
-                <w:color w:val="1D2730"/>
-                <w:sz w:val="17"/>
-              </w:rPr>
-              <w:t>RNF-03</w:t>
-            </w:r>
-          </w:p>
-        </w:tc>
-        <w:tc>
-          <w:tcPr>
-            <w:tcW w:type="dxa" w:w="6019"/>
-            <w:vAlign w:val="center"/>
-            <w:tcMar>
-              <w:top w:w="110" w:type="dxa"/>
-              <w:start w:w="110" w:type="dxa"/>
-              <w:bottom w:w="110" w:type="dxa"/>
-              <w:end w:w="110" w:type="dxa"/>
-            </w:tcMar>
-          </w:tcPr>
-          <w:p>
-            <w:pPr>
-              <w:spacing w:after="20" w:line="247" w:lineRule="auto"/>
-            </w:pPr>
-            <w:r>
-              <w:rPr>
-                <w:rFonts w:ascii="Arial" w:hAnsi="Arial"/>
-                <w:color w:val="1D2730"/>
-                <w:sz w:val="17"/>
-              </w:rPr>
-              <w:t>Las operaciones de entrega y devolución deben mantener la disponibilidad correcta cuando varias solicitudes coincidan.</w:t>
-            </w:r>
-          </w:p>
-        </w:tc>
-        <w:tc>
-          <w:tcPr>
-            <w:tcW w:type="dxa" w:w="2822"/>
-            <w:vAlign w:val="center"/>
-            <w:tcMar>
-              <w:top w:w="110" w:type="dxa"/>
-              <w:start w:w="110" w:type="dxa"/>
-              <w:bottom w:w="110" w:type="dxa"/>
-              <w:end w:w="110" w:type="dxa"/>
-            </w:tcMar>
-          </w:tcPr>
-          <w:p>
-            <w:pPr>
-              <w:spacing w:after="20" w:line="247" w:lineRule="auto"/>
-            </w:pPr>
-            <w:r>
-              <w:rPr>
-                <w:rFonts w:ascii="Arial" w:hAnsi="Arial"/>
-                <w:color w:val="1D2730"/>
-                <w:sz w:val="17"/>
-              </w:rPr>
-              <w:t>Recomendación pendiente de implementar con transacciones y control de concurrencia</w:t>
-            </w:r>
-          </w:p>
-        </w:tc>
-      </w:tr>
-      <w:tr>
-        <w:trPr>
-          <w:cantSplit/>
-        </w:trPr>
-        <w:tc>
-          <w:tcPr>
-            <w:tcW w:type="dxa" w:w="1037"/>
-            <w:vAlign w:val="center"/>
-            <w:tcMar>
-              <w:top w:w="110" w:type="dxa"/>
-              <w:start w:w="110" w:type="dxa"/>
-              <w:bottom w:w="110" w:type="dxa"/>
-              <w:end w:w="110" w:type="dxa"/>
-            </w:tcMar>
-            <w:shd w:fill="EAF1F7"/>
-          </w:tcPr>
-          <w:p>
-            <w:pPr>
-              <w:spacing w:after="20" w:line="247" w:lineRule="auto"/>
-              <w:jc w:val="center"/>
-            </w:pPr>
-            <w:r>
-              <w:rPr>
-                <w:rFonts w:ascii="Arial" w:hAnsi="Arial"/>
-                <w:color w:val="1D2730"/>
-                <w:sz w:val="17"/>
-              </w:rPr>
-              <w:t>RNF-04</w:t>
-            </w:r>
-          </w:p>
-        </w:tc>
-        <w:tc>
-          <w:tcPr>
-            <w:tcW w:type="dxa" w:w="6019"/>
-            <w:vAlign w:val="center"/>
-            <w:tcMar>
-              <w:top w:w="110" w:type="dxa"/>
-              <w:start w:w="110" w:type="dxa"/>
-              <w:bottom w:w="110" w:type="dxa"/>
-              <w:end w:w="110" w:type="dxa"/>
-            </w:tcMar>
-            <w:shd w:fill="EAF1F7"/>
-          </w:tcPr>
-          <w:p>
-            <w:pPr>
-              <w:spacing w:after="20" w:line="247" w:lineRule="auto"/>
-            </w:pPr>
-            <w:r>
-              <w:rPr>
-                <w:rFonts w:ascii="Arial" w:hAnsi="Arial"/>
-                <w:color w:val="1D2730"/>
-                <w:sz w:val="17"/>
-              </w:rPr>
-              <w:t>Las contraseñas deben almacenarse como hashes; la API debe limitar cada operación a usuarios autorizados.</w:t>
-            </w:r>
-          </w:p>
-        </w:tc>
-        <w:tc>
-          <w:tcPr>
-            <w:tcW w:type="dxa" w:w="2822"/>
-            <w:vAlign w:val="center"/>
-            <w:tcMar>
-              <w:top w:w="110" w:type="dxa"/>
-              <w:start w:w="110" w:type="dxa"/>
-              <w:bottom w:w="110" w:type="dxa"/>
-              <w:end w:w="110" w:type="dxa"/>
-            </w:tcMar>
-            <w:shd w:fill="EAF1F7"/>
-          </w:tcPr>
-          <w:p>
-            <w:pPr>
-              <w:spacing w:after="20" w:line="247" w:lineRule="auto"/>
-            </w:pPr>
-            <w:r>
-              <w:rPr>
-                <w:rFonts w:ascii="Arial" w:hAnsi="Arial"/>
-                <w:color w:val="1D2730"/>
-                <w:sz w:val="17"/>
-              </w:rPr>
-              <w:t>El SQL guarda un hash; algoritmo y autorización están pendientes</w:t>
-            </w:r>
-          </w:p>
-        </w:tc>
-      </w:tr>
-      <w:tr>
-        <w:trPr>
-          <w:cantSplit/>
-        </w:trPr>
-        <w:tc>
-          <w:tcPr>
-            <w:tcW w:type="dxa" w:w="1037"/>
-            <w:vAlign w:val="center"/>
-            <w:tcMar>
-              <w:top w:w="110" w:type="dxa"/>
-              <w:start w:w="110" w:type="dxa"/>
-              <w:bottom w:w="110" w:type="dxa"/>
-              <w:end w:w="110" w:type="dxa"/>
-            </w:tcMar>
-          </w:tcPr>
-          <w:p>
-            <w:pPr>
-              <w:spacing w:after="20" w:line="247" w:lineRule="auto"/>
-              <w:jc w:val="center"/>
-            </w:pPr>
-            <w:r>
-              <w:rPr>
-                <w:rFonts w:ascii="Arial" w:hAnsi="Arial"/>
-                <w:color w:val="1D2730"/>
-                <w:sz w:val="17"/>
-              </w:rPr>
-              <w:t>RNF-05</w:t>
-            </w:r>
-          </w:p>
-        </w:tc>
-        <w:tc>
-          <w:tcPr>
-            <w:tcW w:type="dxa" w:w="6019"/>
-            <w:vAlign w:val="center"/>
-            <w:tcMar>
-              <w:top w:w="110" w:type="dxa"/>
-              <w:start w:w="110" w:type="dxa"/>
-              <w:bottom w:w="110" w:type="dxa"/>
-              <w:end w:w="110" w:type="dxa"/>
-            </w:tcMar>
-          </w:tcPr>
-          <w:p>
-            <w:pPr>
-              <w:spacing w:after="20" w:line="247" w:lineRule="auto"/>
-            </w:pPr>
-            <w:r>
-              <w:rPr>
-                <w:rFonts w:ascii="Arial" w:hAnsi="Arial"/>
-                <w:color w:val="1D2730"/>
-                <w:sz w:val="17"/>
-              </w:rPr>
-              <w:t>Las fechas de operación deben incluir zona horaria y conservar una referencia temporal coherente.</w:t>
-            </w:r>
-          </w:p>
-        </w:tc>
-        <w:tc>
-          <w:tcPr>
-            <w:tcW w:type="dxa" w:w="2822"/>
-            <w:vAlign w:val="center"/>
-            <w:tcMar>
-              <w:top w:w="110" w:type="dxa"/>
-              <w:start w:w="110" w:type="dxa"/>
-              <w:bottom w:w="110" w:type="dxa"/>
-              <w:end w:w="110" w:type="dxa"/>
-            </w:tcMar>
-          </w:tcPr>
-          <w:p>
-            <w:pPr>
-              <w:spacing w:after="20" w:line="247" w:lineRule="auto"/>
-            </w:pPr>
-            <w:r>
-              <w:rPr>
-                <w:rFonts w:ascii="Arial" w:hAnsi="Arial"/>
-                <w:color w:val="1D2730"/>
-                <w:sz w:val="17"/>
-              </w:rPr>
-              <w:t xml:space="preserve">Uso de </w:t>
-            </w:r>
-            <w:r>
-              <w:rPr>
-                <w:rFonts w:ascii="Arial" w:hAnsi="Arial"/>
-                <w:color w:val="1D2730"/>
-                <w:sz w:val="17"/>
-              </w:rPr>
-              <w:t>TIMESTAMPTZ</w:t>
-            </w:r>
-            <w:r>
-              <w:rPr>
-                <w:rFonts w:ascii="Arial" w:hAnsi="Arial"/>
-                <w:color w:val="1D2730"/>
-                <w:sz w:val="17"/>
-              </w:rPr>
-              <w:t xml:space="preserve"> en el esquema</w:t>
-            </w:r>
-          </w:p>
-        </w:tc>
-      </w:tr>
-      <w:tr>
-        <w:trPr>
-          <w:cantSplit/>
-        </w:trPr>
-        <w:tc>
-          <w:tcPr>
-            <w:tcW w:type="dxa" w:w="1037"/>
-            <w:vAlign w:val="center"/>
-            <w:tcMar>
-              <w:top w:w="110" w:type="dxa"/>
-              <w:start w:w="110" w:type="dxa"/>
-              <w:bottom w:w="110" w:type="dxa"/>
-              <w:end w:w="110" w:type="dxa"/>
-            </w:tcMar>
-            <w:shd w:fill="EAF1F7"/>
-          </w:tcPr>
-          <w:p>
-            <w:pPr>
-              <w:spacing w:after="20" w:line="247" w:lineRule="auto"/>
-              <w:jc w:val="center"/>
-            </w:pPr>
-            <w:r>
-              <w:rPr>
-                <w:rFonts w:ascii="Arial" w:hAnsi="Arial"/>
-                <w:color w:val="1D2730"/>
-                <w:sz w:val="17"/>
-              </w:rPr>
-              <w:t>RNF-06</w:t>
-            </w:r>
-          </w:p>
-        </w:tc>
-        <w:tc>
-          <w:tcPr>
-            <w:tcW w:type="dxa" w:w="6019"/>
-            <w:vAlign w:val="center"/>
-            <w:tcMar>
-              <w:top w:w="110" w:type="dxa"/>
-              <w:start w:w="110" w:type="dxa"/>
-              <w:bottom w:w="110" w:type="dxa"/>
-              <w:end w:w="110" w:type="dxa"/>
-            </w:tcMar>
-            <w:shd w:fill="EAF1F7"/>
-          </w:tcPr>
-          <w:p>
-            <w:pPr>
-              <w:spacing w:after="20" w:line="247" w:lineRule="auto"/>
-            </w:pPr>
-            <w:r>
-              <w:rPr>
-                <w:rFonts w:ascii="Arial" w:hAnsi="Arial"/>
-                <w:color w:val="1D2730"/>
-                <w:sz w:val="17"/>
-              </w:rPr>
-              <w:t>El dominio debe poder probarse sin depender de FastAPI ni de SQLAlchemy.</w:t>
-            </w:r>
-          </w:p>
-        </w:tc>
-        <w:tc>
-          <w:tcPr>
-            <w:tcW w:type="dxa" w:w="2822"/>
-            <w:vAlign w:val="center"/>
-            <w:tcMar>
-              <w:top w:w="110" w:type="dxa"/>
-              <w:start w:w="110" w:type="dxa"/>
-              <w:bottom w:w="110" w:type="dxa"/>
-              <w:end w:w="110" w:type="dxa"/>
-            </w:tcMar>
-            <w:shd w:fill="EAF1F7"/>
-          </w:tcPr>
-          <w:p>
-            <w:pPr>
-              <w:spacing w:after="20" w:line="247" w:lineRule="auto"/>
-            </w:pPr>
-            <w:r>
-              <w:rPr>
-                <w:rFonts w:ascii="Arial" w:hAnsi="Arial"/>
-                <w:color w:val="1D2730"/>
-                <w:sz w:val="17"/>
-              </w:rPr>
-              <w:t>Decisión de arquitectura propuesta</w:t>
-            </w:r>
-          </w:p>
-        </w:tc>
-      </w:tr>
-      <w:tr>
-        <w:trPr>
-          <w:cantSplit/>
-        </w:trPr>
-        <w:tc>
-          <w:tcPr>
-            <w:tcW w:type="dxa" w:w="1037"/>
-            <w:vAlign w:val="center"/>
-            <w:tcMar>
-              <w:top w:w="110" w:type="dxa"/>
-              <w:start w:w="110" w:type="dxa"/>
-              <w:bottom w:w="110" w:type="dxa"/>
-              <w:end w:w="110" w:type="dxa"/>
-            </w:tcMar>
-          </w:tcPr>
-          <w:p>
-            <w:pPr>
-              <w:spacing w:after="20" w:line="247" w:lineRule="auto"/>
-              <w:jc w:val="center"/>
-            </w:pPr>
-            <w:r>
-              <w:rPr>
-                <w:rFonts w:ascii="Arial" w:hAnsi="Arial"/>
-                <w:color w:val="1D2730"/>
-                <w:sz w:val="17"/>
-              </w:rPr>
-              <w:t>RNF-07</w:t>
-            </w:r>
-          </w:p>
-        </w:tc>
-        <w:tc>
-          <w:tcPr>
-            <w:tcW w:type="dxa" w:w="6019"/>
-            <w:vAlign w:val="center"/>
-            <w:tcMar>
-              <w:top w:w="110" w:type="dxa"/>
-              <w:start w:w="110" w:type="dxa"/>
-              <w:bottom w:w="110" w:type="dxa"/>
-              <w:end w:w="110" w:type="dxa"/>
-            </w:tcMar>
-          </w:tcPr>
-          <w:p>
-            <w:pPr>
-              <w:spacing w:after="20" w:line="247" w:lineRule="auto"/>
-            </w:pPr>
-            <w:r>
-              <w:rPr>
-                <w:rFonts w:ascii="Arial" w:hAnsi="Arial"/>
-                <w:color w:val="1D2730"/>
-                <w:sz w:val="17"/>
-              </w:rPr>
-              <w:t>Las modificaciones del esquema deben ser reproducibles mediante migraciones versionadas.</w:t>
-            </w:r>
-          </w:p>
-        </w:tc>
-        <w:tc>
-          <w:tcPr>
-            <w:tcW w:type="dxa" w:w="2822"/>
-            <w:vAlign w:val="center"/>
-            <w:tcMar>
-              <w:top w:w="110" w:type="dxa"/>
-              <w:start w:w="110" w:type="dxa"/>
-              <w:bottom w:w="110" w:type="dxa"/>
-              <w:end w:w="110" w:type="dxa"/>
-            </w:tcMar>
-          </w:tcPr>
-          <w:p>
-            <w:pPr>
-              <w:spacing w:after="20" w:line="247" w:lineRule="auto"/>
-            </w:pPr>
-            <w:r>
-              <w:rPr>
-                <w:rFonts w:ascii="Arial" w:hAnsi="Arial"/>
-                <w:color w:val="1D2730"/>
-                <w:sz w:val="17"/>
-              </w:rPr>
-              <w:t>Propuesta de Alembic</w:t>
-            </w:r>
-          </w:p>
-        </w:tc>
-      </w:tr>
-      <w:tr>
-        <w:trPr>
-          <w:cantSplit/>
-        </w:trPr>
-        <w:tc>
-          <w:tcPr>
-            <w:tcW w:type="dxa" w:w="1037"/>
-            <w:vAlign w:val="center"/>
-            <w:tcMar>
-              <w:top w:w="110" w:type="dxa"/>
-              <w:start w:w="110" w:type="dxa"/>
-              <w:bottom w:w="110" w:type="dxa"/>
-              <w:end w:w="110" w:type="dxa"/>
-            </w:tcMar>
-            <w:shd w:fill="EAF1F7"/>
-          </w:tcPr>
-          <w:p>
-            <w:pPr>
-              <w:spacing w:after="20" w:line="247" w:lineRule="auto"/>
-              <w:jc w:val="center"/>
-            </w:pPr>
-            <w:r>
-              <w:rPr>
-                <w:rFonts w:ascii="Arial" w:hAnsi="Arial"/>
-                <w:color w:val="1D2730"/>
-                <w:sz w:val="17"/>
-              </w:rPr>
-              <w:t>RNF-08</w:t>
-            </w:r>
-          </w:p>
-        </w:tc>
-        <w:tc>
-          <w:tcPr>
-            <w:tcW w:type="dxa" w:w="6019"/>
-            <w:vAlign w:val="center"/>
-            <w:tcMar>
-              <w:top w:w="110" w:type="dxa"/>
-              <w:start w:w="110" w:type="dxa"/>
-              <w:bottom w:w="110" w:type="dxa"/>
-              <w:end w:w="110" w:type="dxa"/>
-            </w:tcMar>
-            <w:shd w:fill="EAF1F7"/>
-          </w:tcPr>
-          <w:p>
-            <w:pPr>
-              <w:spacing w:after="20" w:line="247" w:lineRule="auto"/>
-            </w:pPr>
-            <w:r>
-              <w:rPr>
-                <w:rFonts w:ascii="Arial" w:hAnsi="Arial"/>
-                <w:color w:val="1D2730"/>
-                <w:sz w:val="17"/>
-              </w:rPr>
-              <w:t>La API debe publicar sus operaciones y estructuras de datos mediante OpenAPI.</w:t>
-            </w:r>
-          </w:p>
-        </w:tc>
-        <w:tc>
-          <w:tcPr>
-            <w:tcW w:type="dxa" w:w="2822"/>
-            <w:vAlign w:val="center"/>
-            <w:tcMar>
-              <w:top w:w="110" w:type="dxa"/>
-              <w:start w:w="110" w:type="dxa"/>
-              <w:bottom w:w="110" w:type="dxa"/>
-              <w:end w:w="110" w:type="dxa"/>
-            </w:tcMar>
-            <w:shd w:fill="EAF1F7"/>
-          </w:tcPr>
-          <w:p>
-            <w:pPr>
-              <w:spacing w:after="20" w:line="247" w:lineRule="auto"/>
-            </w:pPr>
-            <w:r>
-              <w:rPr>
-                <w:rFonts w:ascii="Arial" w:hAnsi="Arial"/>
-                <w:color w:val="1D2730"/>
-                <w:sz w:val="17"/>
-              </w:rPr>
-              <w:t>FastAPI propuesto</w:t>
-            </w:r>
-          </w:p>
-        </w:tc>
-      </w:tr>
-    </w:tbl>
-    <w:p>
-      <w:pPr>
-        <w:spacing w:after="40"/>
-      </w:pPr>
     </w:p>
     <w:p>
       <w:pPr>
-        <w:widowControl/>
-        <w:jc w:val="left"/>
+        <w:pStyle w:val="ListBullet"/>
+        <w:spacing w:after="60"/>
       </w:pPr>
       <w:r>
         <w:rPr>
           <w:rFonts w:ascii="Arial" w:hAnsi="Arial"/>
+          <w:b/>
         </w:rPr>
-        <w:t>Los materiales no fijan metas medibles de rendimiento, disponibilidad, retención de datos o accesibilidad. Esos valores deben levantarse con los usuarios y responsables institucionales antes de aprobar requisitos no funcionales definitivos.</w:t>
+        <w:t>Integridad:</w:t>
+      </w:r>
+      <w:r>
+        <w:rPr>
+          <w:rFonts w:ascii="Arial" w:hAnsi="Arial"/>
+        </w:rPr>
+        <w:t xml:space="preserve"> identificadores únicos, relaciones válidas e intervalos de tiempo consistentes; el SQL ya define varias claves y restricciones.</w:t>
       </w:r>
     </w:p>
     <w:p>
       <w:pPr>
-        <w:pStyle w:val="Heading2"/>
+        <w:pStyle w:val="ListBullet"/>
+        <w:spacing w:after="60"/>
       </w:pPr>
       <w:r>
         <w:rPr>
           <w:rFonts w:ascii="Arial" w:hAnsi="Arial"/>
+          <w:b/>
         </w:rPr>
-        <w:t>Modelo de dominio</w:t>
+        <w:t>Consistencia concurrente:</w:t>
+      </w:r>
+      <w:r>
+        <w:rPr>
+          <w:rFonts w:ascii="Arial" w:hAnsi="Arial"/>
+        </w:rPr>
+        <w:t xml:space="preserve"> impedir la asignación simultánea de una misma unidad; falta implementar transacciones y confirmar una restricción de unicidad para préstamos activos.</w:t>
+      </w:r>
+    </w:p>
+    <w:p>
+      <w:pPr>
+        <w:pStyle w:val="ListBullet"/>
+        <w:spacing w:after="60"/>
+      </w:pPr>
+      <w:r>
+        <w:rPr>
+          <w:rFonts w:ascii="Arial" w:hAnsi="Arial"/>
+          <w:b/>
+        </w:rPr>
+        <w:t>Seguridad:</w:t>
+      </w:r>
+      <w:r>
+        <w:rPr>
+          <w:rFonts w:ascii="Arial" w:hAnsi="Arial"/>
+        </w:rPr>
+        <w:t xml:space="preserve"> almacenar contraseñas como hash y autorizar operaciones por rol; el esquema solo contempla un rol base, por lo que permisos y autenticación están pendientes.</w:t>
+      </w:r>
+    </w:p>
+    <w:p>
+      <w:pPr>
+        <w:pStyle w:val="ListBullet"/>
+        <w:spacing w:after="60"/>
+      </w:pPr>
+      <w:r>
+        <w:rPr>
+          <w:rFonts w:ascii="Arial" w:hAnsi="Arial"/>
+          <w:b/>
+        </w:rPr>
+        <w:t>Mantenibilidad:</w:t>
+      </w:r>
+      <w:r>
+        <w:rPr>
+          <w:rFonts w:ascii="Arial" w:hAnsi="Arial"/>
+        </w:rPr>
+        <w:t xml:space="preserve"> versionar el esquema con migraciones y mantener reglas de negocio independientes de la API y del ORM.</w:t>
+      </w:r>
+    </w:p>
+    <w:p>
+      <w:pPr>
+        <w:pStyle w:val="ListBullet"/>
+        <w:spacing w:after="60"/>
+      </w:pPr>
+      <w:r>
+        <w:rPr>
+          <w:rFonts w:ascii="Arial" w:hAnsi="Arial"/>
+          <w:b/>
+        </w:rPr>
+        <w:t>Trazabilidad:</w:t>
+      </w:r>
+      <w:r>
+        <w:rPr>
+          <w:rFonts w:ascii="Arial" w:hAnsi="Arial"/>
+        </w:rPr>
+        <w:t xml:space="preserve"> registrar actor, fecha y cambios relevantes; el contexto de auditoría del modelo conceptual no está incluido en el SQL actual.</w:t>
       </w:r>
     </w:p>
     <w:p>
@@ -2151,7 +998,42 @@
         <w:rPr>
           <w:rFonts w:ascii="Arial" w:hAnsi="Arial"/>
         </w:rPr>
-        <w:t xml:space="preserve">El modelo conserva los conceptos y asociaciones representados por el SQL. </w:t>
+        <w:t>Los materiales disponibles no especifican objetivos medibles de disponibilidad, rendimiento, retención o accesibilidad. Deben acordarse con los usuarios antes de fijar criterios de aceptación.</w:t>
+      </w:r>
+    </w:p>
+    <w:p>
+      <w:pPr>
+        <w:pStyle w:val="Heading2"/>
+      </w:pPr>
+      <w:r>
+        <w:rPr>
+          <w:rFonts w:ascii="Arial" w:hAnsi="Arial"/>
+        </w:rPr>
+        <w:t>2. Modelo de dominio</w:t>
+      </w:r>
+    </w:p>
+    <w:p>
+      <w:pPr>
+        <w:widowControl/>
+        <w:jc w:val="left"/>
+      </w:pPr>
+      <w:r>
+        <w:rPr>
+          <w:rFonts w:ascii="Arial" w:hAnsi="Arial"/>
+        </w:rPr>
+        <w:t>El diagrama conceptual recibido organiza el problema en contextos delimitados: identidad y acceso, vinculación académica, catálogo e inventario, políticas, reservas, préstamos, garantías, incidencias, sanciones y auditoría. Estos contextos describen el dominio objetivo; no equivalen a tablas ya implementadas.</w:t>
+      </w:r>
+    </w:p>
+    <w:p>
+      <w:pPr>
+        <w:widowControl/>
+        <w:jc w:val="left"/>
+      </w:pPr>
+      <w:r>
+        <w:rPr>
+          <w:rFonts w:ascii="Arial" w:hAnsi="Arial"/>
+        </w:rPr>
+        <w:t xml:space="preserve">La vista de clases presentada a continuación se limita a los conceptos que aparecen en el SQL recibido. </w:t>
       </w:r>
       <w:r>
         <w:rPr>
@@ -2165,7 +1047,7 @@
         <w:rPr>
           <w:rFonts w:ascii="Arial" w:hAnsi="Arial"/>
         </w:rPr>
-        <w:t xml:space="preserve"> identifica al solicitante o al personal que opera el sistema. </w:t>
+        <w:t xml:space="preserve"> se relaciona con </w:t>
       </w:r>
       <w:r>
         <w:rPr>
@@ -2179,7 +1061,105 @@
         <w:rPr>
           <w:rFonts w:ascii="Arial" w:hAnsi="Arial"/>
         </w:rPr>
-        <w:t xml:space="preserve"> contiene las credenciales de acceso. El inventario se organiza como categoría, tipo, ficha y unidad física. Una reserva se solicita para una unidad durante un intervalo. Un préstamo registra la entrega y devolución de esa unidad, y puede provenir de una reserva. Las renovaciones forman un historial ordenado del préstamo [F2, F3].</w:t>
+        <w:t xml:space="preserve">; el inventario se estructura como </w:t>
+      </w:r>
+      <w:r>
+        <w:rPr>
+          <w:rFonts w:ascii="Menlo" w:hAnsi="Menlo"/>
+          <w:color w:val="245B84"/>
+          <w:sz w:val="18"/>
+        </w:rPr>
+        <w:t>CategoriaBien</w:t>
+      </w:r>
+      <w:r>
+        <w:rPr>
+          <w:rFonts w:ascii="Arial" w:hAnsi="Arial"/>
+        </w:rPr>
+        <w:t xml:space="preserve">, </w:t>
+      </w:r>
+      <w:r>
+        <w:rPr>
+          <w:rFonts w:ascii="Menlo" w:hAnsi="Menlo"/>
+          <w:color w:val="245B84"/>
+          <w:sz w:val="18"/>
+        </w:rPr>
+        <w:t>TipoBien</w:t>
+      </w:r>
+      <w:r>
+        <w:rPr>
+          <w:rFonts w:ascii="Arial" w:hAnsi="Arial"/>
+        </w:rPr>
+        <w:t xml:space="preserve">, </w:t>
+      </w:r>
+      <w:r>
+        <w:rPr>
+          <w:rFonts w:ascii="Menlo" w:hAnsi="Menlo"/>
+          <w:color w:val="245B84"/>
+          <w:sz w:val="18"/>
+        </w:rPr>
+        <w:t>FichaBien</w:t>
+      </w:r>
+      <w:r>
+        <w:rPr>
+          <w:rFonts w:ascii="Arial" w:hAnsi="Arial"/>
+        </w:rPr>
+        <w:t xml:space="preserve"> y </w:t>
+      </w:r>
+      <w:r>
+        <w:rPr>
+          <w:rFonts w:ascii="Menlo" w:hAnsi="Menlo"/>
+          <w:color w:val="245B84"/>
+          <w:sz w:val="18"/>
+        </w:rPr>
+        <w:t>UnidadFisica</w:t>
+      </w:r>
+      <w:r>
+        <w:rPr>
+          <w:rFonts w:ascii="Arial" w:hAnsi="Arial"/>
+        </w:rPr>
+        <w:t xml:space="preserve">. </w:t>
+      </w:r>
+      <w:r>
+        <w:rPr>
+          <w:rFonts w:ascii="Menlo" w:hAnsi="Menlo"/>
+          <w:color w:val="245B84"/>
+          <w:sz w:val="18"/>
+        </w:rPr>
+        <w:t>Reserva</w:t>
+      </w:r>
+      <w:r>
+        <w:rPr>
+          <w:rFonts w:ascii="Arial" w:hAnsi="Arial"/>
+        </w:rPr>
+        <w:t xml:space="preserve"> identifica solicitante y unidad. </w:t>
+      </w:r>
+      <w:r>
+        <w:rPr>
+          <w:rFonts w:ascii="Menlo" w:hAnsi="Menlo"/>
+          <w:color w:val="245B84"/>
+          <w:sz w:val="18"/>
+        </w:rPr>
+        <w:t>Prestamo</w:t>
+      </w:r>
+      <w:r>
+        <w:rPr>
+          <w:rFonts w:ascii="Arial" w:hAnsi="Arial"/>
+        </w:rPr>
+        <w:t xml:space="preserve"> registra solicitante, administrador, unidad y una reserva de origen opcional. </w:t>
+      </w:r>
+      <w:r>
+        <w:rPr>
+          <w:rFonts w:ascii="Menlo" w:hAnsi="Menlo"/>
+          <w:color w:val="245B84"/>
+          <w:sz w:val="18"/>
+        </w:rPr>
+        <w:t>Renovacion</w:t>
+      </w:r>
+      <w:r>
+        <w:rPr>
+          <w:rFonts w:ascii="Arial" w:hAnsi="Arial"/>
+        </w:rPr>
+        <w:t xml:space="preserve"> conserva los cambios de vencimiento asociados al préstamo.</w:t>
       </w:r>
     </w:p>
     <w:p>
@@ -2282,7 +1262,7 @@
         <w:rPr>
           <w:rFonts w:ascii="Arial" w:hAnsi="Arial"/>
         </w:rPr>
-        <w:t>La notación de multiplicidad expresa las relaciones definidas por las claves foráneas del esquema. Una persona puede tener cero o una cuenta; cada cuenta corresponde a una persona. Una reserva referencia a una persona y a una unidad. Un préstamo registra por separado solicitante, administrador y unidad, además de una reserva de origen opcional. Cada renovación pertenece a un préstamo y la secuencia no se repite dentro de ese préstamo [F3].</w:t>
+        <w:t>Las multiplicidades reflejan las claves foráneas del esquema. El diseño conceptual añade reglas aún por validar: elegibilidad académica, política aplicada al préstamo, prioridad de reservas, límite de renovaciones, garantías, sanciones e historial de auditoría. El diagrama debe leerse como un modelo parcial de análisis, no como el modelo completo aprobado.</w:t>
       </w:r>
     </w:p>
     <w:p>
@@ -2293,67 +1273,382 @@
         <w:rPr>
           <w:rFonts w:ascii="Arial" w:hAnsi="Arial"/>
         </w:rPr>
-        <w:t>Reglas e invariantes del negocio</w:t>
+        <w:t>Observaciones del análisis del SQL</w:t>
       </w:r>
+    </w:p>
+    <w:tbl>
+      <w:tblPr>
+        <w:tblW w:type="auto" w:w="0"/>
+        <w:jc w:val="center"/>
+        <w:tblLayout w:type="fixed"/>
+        <w:tblLook w:firstColumn="1" w:firstRow="1" w:lastColumn="0" w:lastRow="0" w:noHBand="0" w:noVBand="1" w:val="04A0"/>
+        <w:tblBorders>
+          <w:top w:val="single" w:sz="5" w:space="0" w:color="D4DCE3"/>
+          <w:left w:val="single" w:sz="5" w:space="0" w:color="D4DCE3"/>
+          <w:bottom w:val="single" w:sz="5" w:space="0" w:color="D4DCE3"/>
+          <w:right w:val="single" w:sz="5" w:space="0" w:color="D4DCE3"/>
+          <w:insideH w:val="single" w:sz="5" w:space="0" w:color="D4DCE3"/>
+          <w:insideV w:val="single" w:sz="5" w:space="0" w:color="D4DCE3"/>
+        </w:tblBorders>
+      </w:tblPr>
+      <w:tblGrid>
+        <w:gridCol w:w="4939"/>
+        <w:gridCol w:w="4939"/>
+      </w:tblGrid>
+      <w:tr>
+        <w:trPr>
+          <w:tblHeader w:val="true"/>
+          <w:cantSplit/>
+        </w:trPr>
+        <w:tc>
+          <w:tcPr>
+            <w:tcW w:type="dxa" w:w="1944"/>
+            <w:vAlign w:val="center"/>
+            <w:tcMar>
+              <w:top w:w="110" w:type="dxa"/>
+              <w:start w:w="110" w:type="dxa"/>
+              <w:bottom w:w="110" w:type="dxa"/>
+              <w:end w:w="110" w:type="dxa"/>
+            </w:tcMar>
+            <w:shd w:fill="17324D"/>
+          </w:tcPr>
+          <w:p>
+            <w:pPr>
+              <w:spacing w:after="20" w:line="247" w:lineRule="auto"/>
+            </w:pPr>
+            <w:r>
+              <w:rPr>
+                <w:rFonts w:ascii="Arial" w:hAnsi="Arial"/>
+                <w:b/>
+                <w:color w:val="FFFFFF"/>
+                <w:sz w:val="17"/>
+              </w:rPr>
+              <w:t>Hallazgo</w:t>
+            </w:r>
+          </w:p>
+        </w:tc>
+        <w:tc>
+          <w:tcPr>
+            <w:tcW w:type="dxa" w:w="7934"/>
+            <w:vAlign w:val="center"/>
+            <w:tcMar>
+              <w:top w:w="110" w:type="dxa"/>
+              <w:start w:w="110" w:type="dxa"/>
+              <w:bottom w:w="110" w:type="dxa"/>
+              <w:end w:w="110" w:type="dxa"/>
+            </w:tcMar>
+            <w:shd w:fill="17324D"/>
+          </w:tcPr>
+          <w:p>
+            <w:pPr>
+              <w:spacing w:after="20" w:line="247" w:lineRule="auto"/>
+            </w:pPr>
+            <w:r>
+              <w:rPr>
+                <w:rFonts w:ascii="Arial" w:hAnsi="Arial"/>
+                <w:b/>
+                <w:color w:val="FFFFFF"/>
+                <w:sz w:val="17"/>
+              </w:rPr>
+              <w:t>Implicación para el diseño</w:t>
+            </w:r>
+          </w:p>
+        </w:tc>
+      </w:tr>
+      <w:tr>
+        <w:trPr>
+          <w:cantSplit/>
+        </w:trPr>
+        <w:tc>
+          <w:tcPr>
+            <w:tcW w:type="dxa" w:w="1944"/>
+            <w:vAlign w:val="center"/>
+            <w:tcMar>
+              <w:top w:w="110" w:type="dxa"/>
+              <w:start w:w="110" w:type="dxa"/>
+              <w:bottom w:w="110" w:type="dxa"/>
+              <w:end w:w="110" w:type="dxa"/>
+            </w:tcMar>
+          </w:tcPr>
+          <w:p>
+            <w:pPr>
+              <w:spacing w:after="20" w:line="247" w:lineRule="auto"/>
+            </w:pPr>
+            <w:r>
+              <w:rPr>
+                <w:rFonts w:ascii="Arial" w:hAnsi="Arial"/>
+                <w:color w:val="1D2730"/>
+                <w:sz w:val="17"/>
+              </w:rPr>
+              <w:t>El índice de préstamos por unidad no es único.</w:t>
+            </w:r>
+          </w:p>
+        </w:tc>
+        <w:tc>
+          <w:tcPr>
+            <w:tcW w:type="dxa" w:w="7934"/>
+            <w:vAlign w:val="center"/>
+            <w:tcMar>
+              <w:top w:w="110" w:type="dxa"/>
+              <w:start w:w="110" w:type="dxa"/>
+              <w:bottom w:w="110" w:type="dxa"/>
+              <w:end w:w="110" w:type="dxa"/>
+            </w:tcMar>
+          </w:tcPr>
+          <w:p>
+            <w:pPr>
+              <w:spacing w:after="20" w:line="247" w:lineRule="auto"/>
+            </w:pPr>
+            <w:r>
+              <w:rPr>
+                <w:rFonts w:ascii="Arial" w:hAnsi="Arial"/>
+                <w:color w:val="1D2730"/>
+                <w:sz w:val="17"/>
+              </w:rPr>
+              <w:t>No evita dos préstamos activos o vencidos para la misma unidad; definir y hacer cumplir la regla en base de datos.</w:t>
+            </w:r>
+          </w:p>
+        </w:tc>
+      </w:tr>
+      <w:tr>
+        <w:trPr>
+          <w:cantSplit/>
+        </w:trPr>
+        <w:tc>
+          <w:tcPr>
+            <w:tcW w:type="dxa" w:w="1944"/>
+            <w:vAlign w:val="center"/>
+            <w:tcMar>
+              <w:top w:w="110" w:type="dxa"/>
+              <w:start w:w="110" w:type="dxa"/>
+              <w:bottom w:w="110" w:type="dxa"/>
+              <w:end w:w="110" w:type="dxa"/>
+            </w:tcMar>
+            <w:shd w:fill="EAF1F7"/>
+          </w:tcPr>
+          <w:p>
+            <w:pPr>
+              <w:spacing w:after="20" w:line="247" w:lineRule="auto"/>
+            </w:pPr>
+            <w:r>
+              <w:rPr>
+                <w:rFonts w:ascii="Arial" w:hAnsi="Arial"/>
+                <w:color w:val="1D2730"/>
+                <w:sz w:val="17"/>
+              </w:rPr>
+              <w:t>Un préstamo se crea como activo aunque la entrega puede estar vacía.</w:t>
+            </w:r>
+          </w:p>
+        </w:tc>
+        <w:tc>
+          <w:tcPr>
+            <w:tcW w:type="dxa" w:w="7934"/>
+            <w:vAlign w:val="center"/>
+            <w:tcMar>
+              <w:top w:w="110" w:type="dxa"/>
+              <w:start w:w="110" w:type="dxa"/>
+              <w:bottom w:w="110" w:type="dxa"/>
+              <w:end w:w="110" w:type="dxa"/>
+            </w:tcMar>
+            <w:shd w:fill="EAF1F7"/>
+          </w:tcPr>
+          <w:p>
+            <w:pPr>
+              <w:spacing w:after="20" w:line="247" w:lineRule="auto"/>
+            </w:pPr>
+            <w:r>
+              <w:rPr>
+                <w:rFonts w:ascii="Arial" w:hAnsi="Arial"/>
+                <w:color w:val="1D2730"/>
+                <w:sz w:val="17"/>
+              </w:rPr>
+              <w:t>Separar solicitud/autorización de entrega, o activar el préstamo al registrar la entrega.</w:t>
+            </w:r>
+          </w:p>
+        </w:tc>
+      </w:tr>
+      <w:tr>
+        <w:trPr>
+          <w:cantSplit/>
+        </w:trPr>
+        <w:tc>
+          <w:tcPr>
+            <w:tcW w:type="dxa" w:w="1944"/>
+            <w:vAlign w:val="center"/>
+            <w:tcMar>
+              <w:top w:w="110" w:type="dxa"/>
+              <w:start w:w="110" w:type="dxa"/>
+              <w:bottom w:w="110" w:type="dxa"/>
+              <w:end w:w="110" w:type="dxa"/>
+            </w:tcMar>
+          </w:tcPr>
+          <w:p>
+            <w:pPr>
+              <w:spacing w:after="20" w:line="247" w:lineRule="auto"/>
+            </w:pPr>
+            <w:r>
+              <w:rPr>
+                <w:rFonts w:ascii="Arial" w:hAnsi="Arial"/>
+                <w:color w:val="1D2730"/>
+                <w:sz w:val="17"/>
+              </w:rPr>
+              <w:t>Reserva y préstamo guardan referencias mutuas.</w:t>
+            </w:r>
+          </w:p>
+        </w:tc>
+        <w:tc>
+          <w:tcPr>
+            <w:tcW w:type="dxa" w:w="7934"/>
+            <w:vAlign w:val="center"/>
+            <w:tcMar>
+              <w:top w:w="110" w:type="dxa"/>
+              <w:start w:w="110" w:type="dxa"/>
+              <w:bottom w:w="110" w:type="dxa"/>
+              <w:end w:w="110" w:type="dxa"/>
+            </w:tcMar>
+          </w:tcPr>
+          <w:p>
+            <w:pPr>
+              <w:spacing w:after="20" w:line="247" w:lineRule="auto"/>
+            </w:pPr>
+            <w:r>
+              <w:rPr>
+                <w:rFonts w:ascii="Arial" w:hAnsi="Arial"/>
+                <w:color w:val="1D2730"/>
+                <w:sz w:val="17"/>
+              </w:rPr>
+              <w:t>Definir una relación autoritativa y evitar mantener enlaces redundantes sin necesidad.</w:t>
+            </w:r>
+          </w:p>
+        </w:tc>
+      </w:tr>
+      <w:tr>
+        <w:trPr>
+          <w:cantSplit/>
+        </w:trPr>
+        <w:tc>
+          <w:tcPr>
+            <w:tcW w:type="dxa" w:w="1944"/>
+            <w:vAlign w:val="center"/>
+            <w:tcMar>
+              <w:top w:w="110" w:type="dxa"/>
+              <w:start w:w="110" w:type="dxa"/>
+              <w:bottom w:w="110" w:type="dxa"/>
+              <w:end w:w="110" w:type="dxa"/>
+            </w:tcMar>
+            <w:shd w:fill="EAF1F7"/>
+          </w:tcPr>
+          <w:p>
+            <w:pPr>
+              <w:spacing w:after="20" w:line="247" w:lineRule="auto"/>
+            </w:pPr>
+            <w:r>
+              <w:rPr>
+                <w:rFonts w:ascii="Arial" w:hAnsi="Arial"/>
+                <w:color w:val="1D2730"/>
+                <w:sz w:val="17"/>
+              </w:rPr>
+              <w:t>No hay tablas de políticas ni vínculo académico.</w:t>
+            </w:r>
+          </w:p>
+        </w:tc>
+        <w:tc>
+          <w:tcPr>
+            <w:tcW w:type="dxa" w:w="7934"/>
+            <w:vAlign w:val="center"/>
+            <w:tcMar>
+              <w:top w:w="110" w:type="dxa"/>
+              <w:start w:w="110" w:type="dxa"/>
+              <w:bottom w:w="110" w:type="dxa"/>
+              <w:end w:w="110" w:type="dxa"/>
+            </w:tcMar>
+            <w:shd w:fill="EAF1F7"/>
+          </w:tcPr>
+          <w:p>
+            <w:pPr>
+              <w:spacing w:after="20" w:line="247" w:lineRule="auto"/>
+            </w:pPr>
+            <w:r>
+              <w:rPr>
+                <w:rFonts w:ascii="Arial" w:hAnsi="Arial"/>
+                <w:color w:val="1D2730"/>
+                <w:sz w:val="17"/>
+              </w:rPr>
+              <w:t>No se pueden aplicar límites de préstamo ni comprobar elegibilidad desde el esquema actual.</w:t>
+            </w:r>
+          </w:p>
+        </w:tc>
+      </w:tr>
+      <w:tr>
+        <w:trPr>
+          <w:cantSplit/>
+        </w:trPr>
+        <w:tc>
+          <w:tcPr>
+            <w:tcW w:type="dxa" w:w="1944"/>
+            <w:vAlign w:val="center"/>
+            <w:tcMar>
+              <w:top w:w="110" w:type="dxa"/>
+              <w:start w:w="110" w:type="dxa"/>
+              <w:bottom w:w="110" w:type="dxa"/>
+              <w:end w:w="110" w:type="dxa"/>
+            </w:tcMar>
+          </w:tcPr>
+          <w:p>
+            <w:pPr>
+              <w:spacing w:after="20" w:line="247" w:lineRule="auto"/>
+            </w:pPr>
+            <w:r>
+              <w:rPr>
+                <w:rFonts w:ascii="Arial" w:hAnsi="Arial"/>
+                <w:color w:val="1D2730"/>
+                <w:sz w:val="17"/>
+              </w:rPr>
+              <w:t>Roles administrativos y auditoría no están desarrollados.</w:t>
+            </w:r>
+          </w:p>
+        </w:tc>
+        <w:tc>
+          <w:tcPr>
+            <w:tcW w:type="dxa" w:w="7934"/>
+            <w:vAlign w:val="center"/>
+            <w:tcMar>
+              <w:top w:w="110" w:type="dxa"/>
+              <w:start w:w="110" w:type="dxa"/>
+              <w:bottom w:w="110" w:type="dxa"/>
+              <w:end w:w="110" w:type="dxa"/>
+            </w:tcMar>
+          </w:tcPr>
+          <w:p>
+            <w:pPr>
+              <w:spacing w:after="20" w:line="247" w:lineRule="auto"/>
+            </w:pPr>
+            <w:r>
+              <w:rPr>
+                <w:rFonts w:ascii="Arial" w:hAnsi="Arial"/>
+                <w:color w:val="1D2730"/>
+                <w:sz w:val="17"/>
+              </w:rPr>
+              <w:t>Definir permisos, responsables y eventos antes de operar con datos reales.</w:t>
+            </w:r>
+          </w:p>
+        </w:tc>
+      </w:tr>
+    </w:tbl>
+    <w:p>
+      <w:pPr>
+        <w:spacing w:after="40"/>
+      </w:pPr>
     </w:p>
     <w:p>
       <w:pPr>
-        <w:pStyle w:val="ListBullet"/>
-        <w:spacing w:after="60"/>
+        <w:pStyle w:val="Heading2"/>
       </w:pPr>
       <w:r>
         <w:rPr>
           <w:rFonts w:ascii="Arial" w:hAnsi="Arial"/>
         </w:rPr>
-        <w:t>El código de inventario identifica una sola unidad física.</w:t>
-      </w:r>
-    </w:p>
-    <w:p>
-      <w:pPr>
-        <w:pStyle w:val="ListBullet"/>
-        <w:spacing w:after="60"/>
-      </w:pPr>
-      <w:r>
-        <w:rPr>
-          <w:rFonts w:ascii="Arial" w:hAnsi="Arial"/>
-        </w:rPr>
-        <w:t>El inicio de una reserva debe preceder a su fin. El inicio del plazo de un préstamo debe preceder a su vencimiento.</w:t>
-      </w:r>
-    </w:p>
-    <w:p>
-      <w:pPr>
-        <w:pStyle w:val="ListBullet"/>
-        <w:spacing w:after="60"/>
-      </w:pPr>
-      <w:r>
-        <w:rPr>
-          <w:rFonts w:ascii="Arial" w:hAnsi="Arial"/>
-        </w:rPr>
-        <w:t>La secuencia de renovaciones empieza en uno, no se repite por préstamo y el nuevo vencimiento es posterior al anterior.</w:t>
-      </w:r>
-    </w:p>
-    <w:p>
-      <w:pPr>
-        <w:pStyle w:val="ListBullet"/>
-        <w:spacing w:after="60"/>
-      </w:pPr>
-      <w:r>
-        <w:rPr>
-          <w:rFonts w:ascii="Arial" w:hAnsi="Arial"/>
-        </w:rPr>
-        <w:t>La entrega y la devolución deben registrar quién fue responsable y la condición reportada del bien.</w:t>
-      </w:r>
-    </w:p>
-    <w:p>
-      <w:pPr>
-        <w:pStyle w:val="ListBullet"/>
-        <w:spacing w:after="60"/>
-      </w:pPr>
-      <w:r>
-        <w:rPr>
-          <w:rFonts w:ascii="Arial" w:hAnsi="Arial"/>
-        </w:rPr>
-        <w:t>Una unidad no debe tener más de un préstamo activo o vencido a la vez. El índice parcial actual facilita la consulta, pero no impone unicidad; la base necesita una restricción o índice único parcial si se confirma esta regla.</w:t>
+        <w:t>3. Arquitectura en capas</w:t>
       </w:r>
     </w:p>
     <w:p>
@@ -2365,30 +1660,20 @@
         <w:rPr>
           <w:rFonts w:ascii="Arial" w:hAnsi="Arial"/>
         </w:rPr>
-        <w:t>Las tres primeras reglas aparecen directamente en restricciones o claves del SQL. Las dos últimas se desprenden del flujo operativo propuesto y requieren modelarse y probarse en la aplicación. El modelo conceptual completo también incluye políticas, vinculación académica, garantías, incidencias, sanciones y auditoría; esos contextos no forman parte del SQL recibido [F2, F3].</w:t>
+        <w:t xml:space="preserve">Se propone un </w:t>
       </w:r>
-    </w:p>
-    <w:p>
-      <w:pPr>
-        <w:pStyle w:val="Heading2"/>
-      </w:pPr>
+      <w:r>
+        <w:rPr>
+          <w:rFonts w:ascii="Arial" w:hAnsi="Arial"/>
+          <w:b/>
+        </w:rPr>
+        <w:t>monolito modular</w:t>
+      </w:r>
       <w:r>
         <w:rPr>
           <w:rFonts w:ascii="Arial" w:hAnsi="Arial"/>
         </w:rPr>
-        <w:t>Arquitectura en capas</w:t>
-      </w:r>
-    </w:p>
-    <w:p>
-      <w:pPr>
-        <w:widowControl/>
-        <w:jc w:val="left"/>
-      </w:pPr>
-      <w:r>
-        <w:rPr>
-          <w:rFonts w:ascii="Arial" w:hAnsi="Arial"/>
-        </w:rPr>
-        <w:t>Se propone un monolito modular desplegado como una aplicación. Los contextos delimitados se mantienen como paquetes internos con responsabilidades claras. La arquitectura separa el acceso HTTP, los casos de uso, las reglas del dominio y los adaptadores técnicos. Las dependencias del código apuntan hacia el dominio; la infraestructura implementa las interfaces que necesita la aplicación.</w:t>
+        <w:t xml:space="preserve"> en Python. Los contextos se implementan como módulos dentro de una aplicación, sin llamadas HTTP internas ni separación prematura en microservicios. Esta opción mantiene las operaciones de inventario y préstamo dentro de transacciones consistentes y permite evolucionar los módulos con contratos explícitos.</w:t>
       </w:r>
     </w:p>
     <w:p>
@@ -2491,53 +1776,7 @@
         <w:rPr>
           <w:rFonts w:ascii="Arial" w:hAnsi="Arial"/>
         </w:rPr>
-        <w:t>La capa de presentación traduce solicitudes HTTP a comandos o consultas y convierte respuestas en esquemas de API. La capa de aplicación coordina casos de uso como registrar una unidad, crear una reserva, entregar un préstamo o recibir una devolución. El dominio contiene entidades, reglas y contratos de repositorio. La infraestructura implementa persistencia PostgreSQL, seguridad, configuración y migraciones.</w:t>
-      </w:r>
-    </w:p>
-    <w:p>
-      <w:pPr>
-        <w:pStyle w:val="Heading3"/>
-      </w:pPr>
-      <w:r>
-        <w:rPr>
-          <w:rFonts w:ascii="Arial" w:hAnsi="Arial"/>
-        </w:rPr>
-        <w:t>Flujo de registro de préstamo</w:t>
-      </w:r>
-    </w:p>
-    <w:p>
-      <w:pPr>
-        <w:widowControl/>
-        <w:jc w:val="left"/>
-      </w:pPr>
-      <w:r>
-        <w:rPr>
-          <w:rFonts w:ascii="Arial" w:hAnsi="Arial"/>
-        </w:rPr>
-        <w:t>El personal inicia el caso de uso de entrega desde la API. La aplicación valida al solicitante, comprueba que la unidad se pueda prestar y confirma que no exista otra operación incompatible. Después crea el préstamo y registra la evidencia de entrega dentro de una transacción. El repositorio guarda los cambios en PostgreSQL y el sistema devuelve el préstamo creado. La validación de políticas y condición académica se añadirá cuando esos contextos estén disponibles.</w:t>
-      </w:r>
-    </w:p>
-    <w:p>
-      <w:pPr>
-        <w:widowControl/>
-        <w:jc w:val="left"/>
-      </w:pPr>
-      <w:r>
-        <w:rPr>
-          <w:rFonts w:ascii="Arial" w:hAnsi="Arial"/>
-        </w:rPr>
-        <w:t>La arquitectura no propone llamadas HTTP entre módulos internos ni microservicios separados en esta etapa. Las transacciones de inventario y préstamo necesitan mantener consistencia, y el equipo aún está construyendo la primera versión del producto.</w:t>
-      </w:r>
-    </w:p>
-    <w:p>
-      <w:pPr>
-        <w:pStyle w:val="Heading2"/>
-      </w:pPr>
-      <w:r>
-        <w:rPr>
-          <w:rFonts w:ascii="Arial" w:hAnsi="Arial"/>
-        </w:rPr>
-        <w:t>Tecnologías propuestas</w:t>
+        <w:t>La presentación recibe solicitudes HTTP y valida sus esquemas. La aplicación coordina casos de uso —por ejemplo, registrar una unidad, reservar, entregar o devolver—. El dominio contiene entidades, invariantes y contratos. La infraestructura implementa esos contratos mediante PostgreSQL, SQLAlchemy, seguridad y migraciones. Las dependencias de los casos de uso apuntan al dominio; la infraestructura se conecta a través de interfaces.</w:t>
       </w:r>
     </w:p>
     <w:tbl>
@@ -2615,7 +1854,7 @@
                 <w:color w:val="FFFFFF"/>
                 <w:sz w:val="17"/>
               </w:rPr>
-              <w:t>Tecnología</w:t>
+              <w:t>Tecnología propuesta</w:t>
             </w:r>
           </w:p>
         </w:tc>
@@ -2642,7 +1881,7 @@
                 <w:color w:val="FFFFFF"/>
                 <w:sz w:val="17"/>
               </w:rPr>
-              <w:t>Uso en el sistema</w:t>
+              <w:t>Responsabilidad</w:t>
             </w:r>
           </w:p>
         </w:tc>
@@ -2672,7 +1911,7 @@
                 <w:color w:val="1D2730"/>
                 <w:sz w:val="17"/>
               </w:rPr>
-              <w:t>Lenguaje</w:t>
+              <w:t>API y validación</w:t>
             </w:r>
           </w:p>
         </w:tc>
@@ -2697,7 +1936,7 @@
                 <w:color w:val="1D2730"/>
                 <w:sz w:val="17"/>
               </w:rPr>
-              <w:t>Python 3.13 o superior</w:t>
+              <w:t>Python, FastAPI, Pydantic</w:t>
             </w:r>
           </w:p>
         </w:tc>
@@ -2722,7 +1961,7 @@
                 <w:color w:val="1D2730"/>
                 <w:sz w:val="17"/>
               </w:rPr>
-              <w:t>Reglas, casos de uso y API</w:t>
+              <w:t>Endpoints, esquemas y OpenAPI</w:t>
             </w:r>
           </w:p>
         </w:tc>
@@ -2753,7 +1992,7 @@
                 <w:color w:val="1D2730"/>
                 <w:sz w:val="17"/>
               </w:rPr>
-              <w:t>API</w:t>
+              <w:t>Dominio y aplicación</w:t>
             </w:r>
           </w:p>
         </w:tc>
@@ -2779,7 +2018,7 @@
                 <w:color w:val="1D2730"/>
                 <w:sz w:val="17"/>
               </w:rPr>
-              <w:t>FastAPI y Pydantic</w:t>
+              <w:t>Python tipado</w:t>
             </w:r>
           </w:p>
         </w:tc>
@@ -2805,7 +2044,7 @@
                 <w:color w:val="1D2730"/>
                 <w:sz w:val="17"/>
               </w:rPr>
-              <w:t>Rutas HTTP, validación y OpenAPI</w:t>
+              <w:t>Entidades, reglas y casos de uso</w:t>
             </w:r>
           </w:p>
         </w:tc>
@@ -2835,7 +2074,7 @@
                 <w:color w:val="1D2730"/>
                 <w:sz w:val="17"/>
               </w:rPr>
-              <w:t>Base de datos</w:t>
+              <w:t>Persistencia</w:t>
             </w:r>
           </w:p>
         </w:tc>
@@ -2860,7 +2099,7 @@
                 <w:color w:val="1D2730"/>
                 <w:sz w:val="17"/>
               </w:rPr>
-              <w:t>PostgreSQL</w:t>
+              <w:t>PostgreSQL, SQLAlchemy 2, Psycopg 3</w:t>
             </w:r>
           </w:p>
         </w:tc>
@@ -2885,7 +2124,7 @@
                 <w:color w:val="1D2730"/>
                 <w:sz w:val="17"/>
               </w:rPr>
-              <w:t>Persistencia relacional y restricciones</w:t>
+              <w:t>Restricciones, consultas y transacciones</w:t>
             </w:r>
           </w:p>
         </w:tc>
@@ -2916,7 +2155,7 @@
                 <w:color w:val="1D2730"/>
                 <w:sz w:val="17"/>
               </w:rPr>
-              <w:t>Acceso a datos</w:t>
+              <w:t>Evolución del esquema</w:t>
             </w:r>
           </w:p>
         </w:tc>
@@ -2942,7 +2181,7 @@
                 <w:color w:val="1D2730"/>
                 <w:sz w:val="17"/>
               </w:rPr>
-              <w:t>SQLAlchemy 2 y Psycopg 3</w:t>
+              <w:t>Alembic</w:t>
             </w:r>
           </w:p>
         </w:tc>
@@ -2968,7 +2207,7 @@
                 <w:color w:val="1D2730"/>
                 <w:sz w:val="17"/>
               </w:rPr>
-              <w:t>Mapeo y transacciones</w:t>
+              <w:t>Migraciones versionadas</w:t>
             </w:r>
           </w:p>
         </w:tc>
@@ -2998,7 +2237,7 @@
                 <w:color w:val="1D2730"/>
                 <w:sz w:val="17"/>
               </w:rPr>
-              <w:t>Migraciones</w:t>
+              <w:t>Calidad</w:t>
             </w:r>
           </w:p>
         </w:tc>
@@ -3023,7 +2262,7 @@
                 <w:color w:val="1D2730"/>
                 <w:sz w:val="17"/>
               </w:rPr>
-              <w:t>Alembic</w:t>
+              <w:t>pytest, Ruff, mypy</w:t>
             </w:r>
           </w:p>
         </w:tc>
@@ -3048,7 +2287,7 @@
                 <w:color w:val="1D2730"/>
                 <w:sz w:val="17"/>
               </w:rPr>
-              <w:t>Evolución versionada del esquema</w:t>
+              <w:t>Pruebas, estilo y tipos</w:t>
             </w:r>
           </w:p>
         </w:tc>
@@ -3079,170 +2318,7 @@
                 <w:color w:val="1D2730"/>
                 <w:sz w:val="17"/>
               </w:rPr>
-              <w:t>Autenticación</w:t>
-            </w:r>
-          </w:p>
-        </w:tc>
-        <w:tc>
-          <w:tcPr>
-            <w:tcW w:type="dxa" w:w="5112"/>
-            <w:vAlign w:val="center"/>
-            <w:tcMar>
-              <w:top w:w="110" w:type="dxa"/>
-              <w:start w:w="110" w:type="dxa"/>
-              <w:bottom w:w="110" w:type="dxa"/>
-              <w:end w:w="110" w:type="dxa"/>
-            </w:tcMar>
-            <w:shd w:fill="EAF1F7"/>
-          </w:tcPr>
-          <w:p>
-            <w:pPr>
-              <w:spacing w:after="20" w:line="247" w:lineRule="auto"/>
-            </w:pPr>
-            <w:r>
-              <w:rPr>
-                <w:rFonts w:ascii="Arial" w:hAnsi="Arial"/>
-                <w:color w:val="1D2730"/>
-                <w:sz w:val="17"/>
-              </w:rPr>
-              <w:t>Hash Argon2id y tokens de acceso</w:t>
-            </w:r>
-          </w:p>
-        </w:tc>
-        <w:tc>
-          <w:tcPr>
-            <w:tcW w:type="dxa" w:w="2808"/>
-            <w:vAlign w:val="center"/>
-            <w:tcMar>
-              <w:top w:w="110" w:type="dxa"/>
-              <w:start w:w="110" w:type="dxa"/>
-              <w:bottom w:w="110" w:type="dxa"/>
-              <w:end w:w="110" w:type="dxa"/>
-            </w:tcMar>
-            <w:shd w:fill="EAF1F7"/>
-          </w:tcPr>
-          <w:p>
-            <w:pPr>
-              <w:spacing w:after="20" w:line="247" w:lineRule="auto"/>
-            </w:pPr>
-            <w:r>
-              <w:rPr>
-                <w:rFonts w:ascii="Arial" w:hAnsi="Arial"/>
-                <w:color w:val="1D2730"/>
-                <w:sz w:val="17"/>
-              </w:rPr>
-              <w:t>Credenciales y sesiones de API; diseño por concretar</w:t>
-            </w:r>
-          </w:p>
-        </w:tc>
-      </w:tr>
-      <w:tr>
-        <w:trPr>
-          <w:cantSplit/>
-        </w:trPr>
-        <w:tc>
-          <w:tcPr>
-            <w:tcW w:type="dxa" w:w="2592"/>
-            <w:vAlign w:val="center"/>
-            <w:tcMar>
-              <w:top w:w="110" w:type="dxa"/>
-              <w:start w:w="110" w:type="dxa"/>
-              <w:bottom w:w="110" w:type="dxa"/>
-              <w:end w:w="110" w:type="dxa"/>
-            </w:tcMar>
-          </w:tcPr>
-          <w:p>
-            <w:pPr>
-              <w:spacing w:after="20" w:line="247" w:lineRule="auto"/>
-            </w:pPr>
-            <w:r>
-              <w:rPr>
-                <w:rFonts w:ascii="Arial" w:hAnsi="Arial"/>
-                <w:color w:val="1D2730"/>
-                <w:sz w:val="17"/>
-              </w:rPr>
-              <w:t>Pruebas y calidad</w:t>
-            </w:r>
-          </w:p>
-        </w:tc>
-        <w:tc>
-          <w:tcPr>
-            <w:tcW w:type="dxa" w:w="5112"/>
-            <w:vAlign w:val="center"/>
-            <w:tcMar>
-              <w:top w:w="110" w:type="dxa"/>
-              <w:start w:w="110" w:type="dxa"/>
-              <w:bottom w:w="110" w:type="dxa"/>
-              <w:end w:w="110" w:type="dxa"/>
-            </w:tcMar>
-          </w:tcPr>
-          <w:p>
-            <w:pPr>
-              <w:spacing w:after="20" w:line="247" w:lineRule="auto"/>
-            </w:pPr>
-            <w:r>
-              <w:rPr>
-                <w:rFonts w:ascii="Arial" w:hAnsi="Arial"/>
-                <w:color w:val="1D2730"/>
-                <w:sz w:val="17"/>
-              </w:rPr>
-              <w:t>pytest, Ruff y mypy</w:t>
-            </w:r>
-          </w:p>
-        </w:tc>
-        <w:tc>
-          <w:tcPr>
-            <w:tcW w:type="dxa" w:w="2808"/>
-            <w:vAlign w:val="center"/>
-            <w:tcMar>
-              <w:top w:w="110" w:type="dxa"/>
-              <w:start w:w="110" w:type="dxa"/>
-              <w:bottom w:w="110" w:type="dxa"/>
-              <w:end w:w="110" w:type="dxa"/>
-            </w:tcMar>
-          </w:tcPr>
-          <w:p>
-            <w:pPr>
-              <w:spacing w:after="20" w:line="247" w:lineRule="auto"/>
-            </w:pPr>
-            <w:r>
-              <w:rPr>
-                <w:rFonts w:ascii="Arial" w:hAnsi="Arial"/>
-                <w:color w:val="1D2730"/>
-                <w:sz w:val="17"/>
-              </w:rPr>
-              <w:t>Pruebas, estilo y tipado</w:t>
-            </w:r>
-          </w:p>
-        </w:tc>
-      </w:tr>
-      <w:tr>
-        <w:trPr>
-          <w:cantSplit/>
-        </w:trPr>
-        <w:tc>
-          <w:tcPr>
-            <w:tcW w:type="dxa" w:w="2592"/>
-            <w:vAlign w:val="center"/>
-            <w:tcMar>
-              <w:top w:w="110" w:type="dxa"/>
-              <w:start w:w="110" w:type="dxa"/>
-              <w:bottom w:w="110" w:type="dxa"/>
-              <w:end w:w="110" w:type="dxa"/>
-            </w:tcMar>
-            <w:shd w:fill="EAF1F7"/>
-          </w:tcPr>
-          <w:p>
-            <w:pPr>
-              <w:spacing w:after="20" w:line="247" w:lineRule="auto"/>
-            </w:pPr>
-            <w:r>
-              <w:rPr>
-                <w:rFonts w:ascii="Arial" w:hAnsi="Arial"/>
-                <w:color w:val="1D2730"/>
-                <w:sz w:val="17"/>
-              </w:rPr>
-              <w:t>Entorno local</w:t>
+              <w:t>Desarrollo local</w:t>
             </w:r>
           </w:p>
         </w:tc>
@@ -3294,7 +2370,7 @@
                 <w:color w:val="1D2730"/>
                 <w:sz w:val="17"/>
               </w:rPr>
-              <w:t>Ejecución reproducible de PostgreSQL</w:t>
+              <w:t>Entorno reproducible de PostgreSQL</w:t>
             </w:r>
           </w:p>
         </w:tc>
@@ -3314,7 +2390,7 @@
         <w:rPr>
           <w:rFonts w:ascii="Arial" w:hAnsi="Arial"/>
         </w:rPr>
-        <w:t>Estas tecnologías siguen la propuesta documentada en el repositorio [F4]. La interfaz web no está definida en este informe; debe elegirse cuando los flujos de API e inventario estén estabilizados.</w:t>
+        <w:t>La interfaz web queda fuera de este primer alcance; conviene elegirla después de estabilizar los flujos de API. Las tecnologías son una propuesta documentada en el repositorio, no componentes ya implementados.</w:t>
       </w:r>
     </w:p>
     <w:p>
@@ -3325,7 +2401,7 @@
         <w:rPr>
           <w:rFonts w:ascii="Arial" w:hAnsi="Arial"/>
         </w:rPr>
-        <w:t>Revisión del esquema SQL</w:t>
+        <w:t>Conclusión</w:t>
       </w:r>
     </w:p>
     <w:p>
@@ -3337,673 +2413,7 @@
         <w:rPr>
           <w:rFonts w:ascii="Arial" w:hAnsi="Arial"/>
         </w:rPr>
-        <w:t>El esquema es una base concreta para BC-01, BC-03, BC-05 y BC-06. Incluye claves UUID, unicidad de CUI, correo, usuario y código de inventario; restricciones para intervalos; estados de reserva, unidad y préstamo; y datos de entrega, devolución y renovación [F3]. Antes de migrarlo al proyecto conviene cerrar las siguientes decisiones.</w:t>
-      </w:r>
-    </w:p>
-    <w:p>
-      <w:r>
-        <w:br w:type="page"/>
-      </w:r>
-    </w:p>
-    <w:tbl>
-      <w:tblPr>
-        <w:tblW w:type="auto" w:w="0"/>
-        <w:jc w:val="center"/>
-        <w:tblLayout w:type="fixed"/>
-        <w:tblLook w:firstColumn="1" w:firstRow="1" w:lastColumn="0" w:lastRow="0" w:noHBand="0" w:noVBand="1" w:val="04A0"/>
-        <w:tblBorders>
-          <w:top w:val="single" w:sz="5" w:space="0" w:color="D4DCE3"/>
-          <w:left w:val="single" w:sz="5" w:space="0" w:color="D4DCE3"/>
-          <w:bottom w:val="single" w:sz="5" w:space="0" w:color="D4DCE3"/>
-          <w:right w:val="single" w:sz="5" w:space="0" w:color="D4DCE3"/>
-          <w:insideH w:val="single" w:sz="5" w:space="0" w:color="D4DCE3"/>
-          <w:insideV w:val="single" w:sz="5" w:space="0" w:color="D4DCE3"/>
-        </w:tblBorders>
-      </w:tblPr>
-      <w:tblGrid>
-        <w:gridCol w:w="3293"/>
-        <w:gridCol w:w="3293"/>
-        <w:gridCol w:w="3293"/>
-      </w:tblGrid>
-      <w:tr>
-        <w:trPr>
-          <w:tblHeader w:val="true"/>
-          <w:cantSplit/>
-        </w:trPr>
-        <w:tc>
-          <w:tcPr>
-            <w:tcW w:type="dxa" w:w="2088"/>
-            <w:vAlign w:val="center"/>
-            <w:tcMar>
-              <w:top w:w="110" w:type="dxa"/>
-              <w:start w:w="110" w:type="dxa"/>
-              <w:bottom w:w="110" w:type="dxa"/>
-              <w:end w:w="110" w:type="dxa"/>
-            </w:tcMar>
-            <w:shd w:fill="17324D"/>
-          </w:tcPr>
-          <w:p>
-            <w:pPr>
-              <w:spacing w:after="20" w:line="247" w:lineRule="auto"/>
-            </w:pPr>
-            <w:r>
-              <w:rPr>
-                <w:rFonts w:ascii="Arial" w:hAnsi="Arial"/>
-                <w:b/>
-                <w:color w:val="FFFFFF"/>
-                <w:sz w:val="17"/>
-              </w:rPr>
-              <w:t>Hallazgo</w:t>
-            </w:r>
-          </w:p>
-        </w:tc>
-        <w:tc>
-          <w:tcPr>
-            <w:tcW w:type="dxa" w:w="3672"/>
-            <w:vAlign w:val="center"/>
-            <w:tcMar>
-              <w:top w:w="110" w:type="dxa"/>
-              <w:start w:w="110" w:type="dxa"/>
-              <w:bottom w:w="110" w:type="dxa"/>
-              <w:end w:w="110" w:type="dxa"/>
-            </w:tcMar>
-            <w:shd w:fill="17324D"/>
-          </w:tcPr>
-          <w:p>
-            <w:pPr>
-              <w:spacing w:after="20" w:line="247" w:lineRule="auto"/>
-            </w:pPr>
-            <w:r>
-              <w:rPr>
-                <w:rFonts w:ascii="Arial" w:hAnsi="Arial"/>
-                <w:b/>
-                <w:color w:val="FFFFFF"/>
-                <w:sz w:val="17"/>
-              </w:rPr>
-              <w:t>Consecuencia</w:t>
-            </w:r>
-          </w:p>
-        </w:tc>
-        <w:tc>
-          <w:tcPr>
-            <w:tcW w:type="dxa" w:w="4118"/>
-            <w:vAlign w:val="center"/>
-            <w:tcMar>
-              <w:top w:w="110" w:type="dxa"/>
-              <w:start w:w="110" w:type="dxa"/>
-              <w:bottom w:w="110" w:type="dxa"/>
-              <w:end w:w="110" w:type="dxa"/>
-            </w:tcMar>
-            <w:shd w:fill="17324D"/>
-          </w:tcPr>
-          <w:p>
-            <w:pPr>
-              <w:spacing w:after="20" w:line="247" w:lineRule="auto"/>
-            </w:pPr>
-            <w:r>
-              <w:rPr>
-                <w:rFonts w:ascii="Arial" w:hAnsi="Arial"/>
-                <w:b/>
-                <w:color w:val="FFFFFF"/>
-                <w:sz w:val="17"/>
-              </w:rPr>
-              <w:t>Acción recomendada</w:t>
-            </w:r>
-          </w:p>
-        </w:tc>
-      </w:tr>
-      <w:tr>
-        <w:trPr>
-          <w:cantSplit/>
-        </w:trPr>
-        <w:tc>
-          <w:tcPr>
-            <w:tcW w:type="dxa" w:w="2088"/>
-            <w:vAlign w:val="center"/>
-            <w:tcMar>
-              <w:top w:w="110" w:type="dxa"/>
-              <w:start w:w="110" w:type="dxa"/>
-              <w:bottom w:w="110" w:type="dxa"/>
-              <w:end w:w="110" w:type="dxa"/>
-            </w:tcMar>
-          </w:tcPr>
-          <w:p>
-            <w:pPr>
-              <w:spacing w:after="20" w:line="247" w:lineRule="auto"/>
-            </w:pPr>
-            <w:r>
-              <w:rPr>
-                <w:rFonts w:ascii="Arial" w:hAnsi="Arial"/>
-                <w:color w:val="1D2730"/>
-                <w:sz w:val="17"/>
-              </w:rPr>
-              <w:t>idx_prestamo_unidad</w:t>
-            </w:r>
-            <w:r>
-              <w:rPr>
-                <w:rFonts w:ascii="Arial" w:hAnsi="Arial"/>
-                <w:color w:val="1D2730"/>
-                <w:sz w:val="17"/>
-              </w:rPr>
-              <w:t xml:space="preserve"> es un índice parcial no único.</w:t>
-            </w:r>
-          </w:p>
-        </w:tc>
-        <w:tc>
-          <w:tcPr>
-            <w:tcW w:type="dxa" w:w="3672"/>
-            <w:vAlign w:val="center"/>
-            <w:tcMar>
-              <w:top w:w="110" w:type="dxa"/>
-              <w:start w:w="110" w:type="dxa"/>
-              <w:bottom w:w="110" w:type="dxa"/>
-              <w:end w:w="110" w:type="dxa"/>
-            </w:tcMar>
-          </w:tcPr>
-          <w:p>
-            <w:pPr>
-              <w:spacing w:after="20" w:line="247" w:lineRule="auto"/>
-            </w:pPr>
-            <w:r>
-              <w:rPr>
-                <w:rFonts w:ascii="Arial" w:hAnsi="Arial"/>
-                <w:color w:val="1D2730"/>
-                <w:sz w:val="17"/>
-              </w:rPr>
-              <w:t>La base permite más de un préstamo activo o vencido sobre la misma unidad.</w:t>
-            </w:r>
-          </w:p>
-        </w:tc>
-        <w:tc>
-          <w:tcPr>
-            <w:tcW w:type="dxa" w:w="4118"/>
-            <w:vAlign w:val="center"/>
-            <w:tcMar>
-              <w:top w:w="110" w:type="dxa"/>
-              <w:start w:w="110" w:type="dxa"/>
-              <w:bottom w:w="110" w:type="dxa"/>
-              <w:end w:w="110" w:type="dxa"/>
-            </w:tcMar>
-          </w:tcPr>
-          <w:p>
-            <w:pPr>
-              <w:spacing w:after="20" w:line="247" w:lineRule="auto"/>
-            </w:pPr>
-            <w:r>
-              <w:rPr>
-                <w:rFonts w:ascii="Arial" w:hAnsi="Arial"/>
-                <w:color w:val="1D2730"/>
-                <w:sz w:val="17"/>
-              </w:rPr>
-              <w:t>Si la regla se confirma, reemplazarlo por un índice único parcial o una restricción equivalente.</w:t>
-            </w:r>
-          </w:p>
-        </w:tc>
-      </w:tr>
-      <w:tr>
-        <w:trPr>
-          <w:cantSplit/>
-        </w:trPr>
-        <w:tc>
-          <w:tcPr>
-            <w:tcW w:type="dxa" w:w="2088"/>
-            <w:vAlign w:val="center"/>
-            <w:tcMar>
-              <w:top w:w="110" w:type="dxa"/>
-              <w:start w:w="110" w:type="dxa"/>
-              <w:bottom w:w="110" w:type="dxa"/>
-              <w:end w:w="110" w:type="dxa"/>
-            </w:tcMar>
-            <w:shd w:fill="EAF1F7"/>
-          </w:tcPr>
-          <w:p>
-            <w:pPr>
-              <w:spacing w:after="20" w:line="247" w:lineRule="auto"/>
-            </w:pPr>
-            <w:r>
-              <w:rPr>
-                <w:rFonts w:ascii="Arial" w:hAnsi="Arial"/>
-                <w:color w:val="1D2730"/>
-                <w:sz w:val="17"/>
-              </w:rPr>
-              <w:t xml:space="preserve">El préstamo inicia como </w:t>
-            </w:r>
-            <w:r>
-              <w:rPr>
-                <w:rFonts w:ascii="Arial" w:hAnsi="Arial"/>
-                <w:color w:val="1D2730"/>
-                <w:sz w:val="17"/>
-              </w:rPr>
-              <w:t>ACTIVO</w:t>
-            </w:r>
-            <w:r>
-              <w:rPr>
-                <w:rFonts w:ascii="Arial" w:hAnsi="Arial"/>
-                <w:color w:val="1D2730"/>
-                <w:sz w:val="17"/>
-              </w:rPr>
-              <w:t>, aunque los datos de entrega pueden ser nulos.</w:t>
-            </w:r>
-          </w:p>
-        </w:tc>
-        <w:tc>
-          <w:tcPr>
-            <w:tcW w:type="dxa" w:w="3672"/>
-            <w:vAlign w:val="center"/>
-            <w:tcMar>
-              <w:top w:w="110" w:type="dxa"/>
-              <w:start w:w="110" w:type="dxa"/>
-              <w:bottom w:w="110" w:type="dxa"/>
-              <w:end w:w="110" w:type="dxa"/>
-            </w:tcMar>
-            <w:shd w:fill="EAF1F7"/>
-          </w:tcPr>
-          <w:p>
-            <w:pPr>
-              <w:spacing w:after="20" w:line="247" w:lineRule="auto"/>
-            </w:pPr>
-            <w:r>
-              <w:rPr>
-                <w:rFonts w:ascii="Arial" w:hAnsi="Arial"/>
-                <w:color w:val="1D2730"/>
-                <w:sz w:val="17"/>
-              </w:rPr>
-              <w:t>Puede existir un préstamo aparentemente activo antes de entregar físicamente el bien.</w:t>
-            </w:r>
-          </w:p>
-        </w:tc>
-        <w:tc>
-          <w:tcPr>
-            <w:tcW w:type="dxa" w:w="4118"/>
-            <w:vAlign w:val="center"/>
-            <w:tcMar>
-              <w:top w:w="110" w:type="dxa"/>
-              <w:start w:w="110" w:type="dxa"/>
-              <w:bottom w:w="110" w:type="dxa"/>
-              <w:end w:w="110" w:type="dxa"/>
-            </w:tcMar>
-            <w:shd w:fill="EAF1F7"/>
-          </w:tcPr>
-          <w:p>
-            <w:pPr>
-              <w:spacing w:after="20" w:line="247" w:lineRule="auto"/>
-            </w:pPr>
-            <w:r>
-              <w:rPr>
-                <w:rFonts w:ascii="Arial" w:hAnsi="Arial"/>
-                <w:color w:val="1D2730"/>
-                <w:sz w:val="17"/>
-              </w:rPr>
-              <w:t>Definir un estado previo a la entrega o activar el préstamo al confirmar la entrega.</w:t>
-            </w:r>
-          </w:p>
-        </w:tc>
-      </w:tr>
-      <w:tr>
-        <w:trPr>
-          <w:cantSplit/>
-        </w:trPr>
-        <w:tc>
-          <w:tcPr>
-            <w:tcW w:type="dxa" w:w="2088"/>
-            <w:vAlign w:val="center"/>
-            <w:tcMar>
-              <w:top w:w="110" w:type="dxa"/>
-              <w:start w:w="110" w:type="dxa"/>
-              <w:bottom w:w="110" w:type="dxa"/>
-              <w:end w:w="110" w:type="dxa"/>
-            </w:tcMar>
-          </w:tcPr>
-          <w:p>
-            <w:pPr>
-              <w:spacing w:after="20" w:line="247" w:lineRule="auto"/>
-            </w:pPr>
-            <w:r>
-              <w:rPr>
-                <w:rFonts w:ascii="Arial" w:hAnsi="Arial"/>
-                <w:color w:val="1D2730"/>
-                <w:sz w:val="17"/>
-              </w:rPr>
-              <w:t>Reserva y préstamo se enlazan en ambos sentidos.</w:t>
-            </w:r>
-          </w:p>
-        </w:tc>
-        <w:tc>
-          <w:tcPr>
-            <w:tcW w:type="dxa" w:w="3672"/>
-            <w:vAlign w:val="center"/>
-            <w:tcMar>
-              <w:top w:w="110" w:type="dxa"/>
-              <w:start w:w="110" w:type="dxa"/>
-              <w:bottom w:w="110" w:type="dxa"/>
-              <w:end w:w="110" w:type="dxa"/>
-            </w:tcMar>
-          </w:tcPr>
-          <w:p>
-            <w:pPr>
-              <w:spacing w:after="20" w:line="247" w:lineRule="auto"/>
-            </w:pPr>
-            <w:r>
-              <w:rPr>
-                <w:rFonts w:ascii="Arial" w:hAnsi="Arial"/>
-                <w:color w:val="1D2730"/>
-                <w:sz w:val="17"/>
-              </w:rPr>
-              <w:t>Se crean dos referencias para representar el préstamo generado por una reserva.</w:t>
-            </w:r>
-          </w:p>
-        </w:tc>
-        <w:tc>
-          <w:tcPr>
-            <w:tcW w:type="dxa" w:w="4118"/>
-            <w:vAlign w:val="center"/>
-            <w:tcMar>
-              <w:top w:w="110" w:type="dxa"/>
-              <w:start w:w="110" w:type="dxa"/>
-              <w:bottom w:w="110" w:type="dxa"/>
-              <w:end w:w="110" w:type="dxa"/>
-            </w:tcMar>
-          </w:tcPr>
-          <w:p>
-            <w:pPr>
-              <w:spacing w:after="20" w:line="247" w:lineRule="auto"/>
-            </w:pPr>
-            <w:r>
-              <w:rPr>
-                <w:rFonts w:ascii="Arial" w:hAnsi="Arial"/>
-                <w:color w:val="1D2730"/>
-                <w:sz w:val="17"/>
-              </w:rPr>
-              <w:t>Elegir una relación autoritativa y conservar la otra solo si hay una necesidad de consulta clara.</w:t>
-            </w:r>
-          </w:p>
-        </w:tc>
-      </w:tr>
-      <w:tr>
-        <w:trPr>
-          <w:cantSplit/>
-        </w:trPr>
-        <w:tc>
-          <w:tcPr>
-            <w:tcW w:type="dxa" w:w="2088"/>
-            <w:vAlign w:val="center"/>
-            <w:tcMar>
-              <w:top w:w="110" w:type="dxa"/>
-              <w:start w:w="110" w:type="dxa"/>
-              <w:bottom w:w="110" w:type="dxa"/>
-              <w:end w:w="110" w:type="dxa"/>
-            </w:tcMar>
-            <w:shd w:fill="EAF1F7"/>
-          </w:tcPr>
-          <w:p>
-            <w:pPr>
-              <w:spacing w:after="20" w:line="247" w:lineRule="auto"/>
-            </w:pPr>
-            <w:r>
-              <w:rPr>
-                <w:rFonts w:ascii="Arial" w:hAnsi="Arial"/>
-                <w:color w:val="1D2730"/>
-                <w:sz w:val="17"/>
-              </w:rPr>
-              <w:t>unidad_tiempo</w:t>
-            </w:r>
-            <w:r>
-              <w:rPr>
-                <w:rFonts w:ascii="Arial" w:hAnsi="Arial"/>
-                <w:color w:val="1D2730"/>
-                <w:sz w:val="17"/>
-              </w:rPr>
-              <w:t xml:space="preserve"> está declarado, pero no se usa; no hay tablas de políticas.</w:t>
-            </w:r>
-          </w:p>
-        </w:tc>
-        <w:tc>
-          <w:tcPr>
-            <w:tcW w:type="dxa" w:w="3672"/>
-            <w:vAlign w:val="center"/>
-            <w:tcMar>
-              <w:top w:w="110" w:type="dxa"/>
-              <w:start w:w="110" w:type="dxa"/>
-              <w:bottom w:w="110" w:type="dxa"/>
-              <w:end w:w="110" w:type="dxa"/>
-            </w:tcMar>
-            <w:shd w:fill="EAF1F7"/>
-          </w:tcPr>
-          <w:p>
-            <w:pPr>
-              <w:spacing w:after="20" w:line="247" w:lineRule="auto"/>
-            </w:pPr>
-            <w:r>
-              <w:rPr>
-                <w:rFonts w:ascii="Arial" w:hAnsi="Arial"/>
-                <w:color w:val="1D2730"/>
-                <w:sz w:val="17"/>
-              </w:rPr>
-              <w:t>El esquema no permite calcular el plazo permitido según perfil o tipo de bien.</w:t>
-            </w:r>
-          </w:p>
-        </w:tc>
-        <w:tc>
-          <w:tcPr>
-            <w:tcW w:type="dxa" w:w="4118"/>
-            <w:vAlign w:val="center"/>
-            <w:tcMar>
-              <w:top w:w="110" w:type="dxa"/>
-              <w:start w:w="110" w:type="dxa"/>
-              <w:bottom w:w="110" w:type="dxa"/>
-              <w:end w:w="110" w:type="dxa"/>
-            </w:tcMar>
-            <w:shd w:fill="EAF1F7"/>
-          </w:tcPr>
-          <w:p>
-            <w:pPr>
-              <w:spacing w:after="20" w:line="247" w:lineRule="auto"/>
-            </w:pPr>
-            <w:r>
-              <w:rPr>
-                <w:rFonts w:ascii="Arial" w:hAnsi="Arial"/>
-                <w:color w:val="1D2730"/>
-                <w:sz w:val="17"/>
-              </w:rPr>
-              <w:t>Incorporar BC-04 y guardar en el préstamo una copia de las condiciones aplicadas.</w:t>
-            </w:r>
-          </w:p>
-        </w:tc>
-      </w:tr>
-      <w:tr>
-        <w:trPr>
-          <w:cantSplit/>
-        </w:trPr>
-        <w:tc>
-          <w:tcPr>
-            <w:tcW w:type="dxa" w:w="2088"/>
-            <w:vAlign w:val="center"/>
-            <w:tcMar>
-              <w:top w:w="110" w:type="dxa"/>
-              <w:start w:w="110" w:type="dxa"/>
-              <w:bottom w:w="110" w:type="dxa"/>
-              <w:end w:w="110" w:type="dxa"/>
-            </w:tcMar>
-          </w:tcPr>
-          <w:p>
-            <w:pPr>
-              <w:spacing w:after="20" w:line="247" w:lineRule="auto"/>
-            </w:pPr>
-            <w:r>
-              <w:rPr>
-                <w:rFonts w:ascii="Arial" w:hAnsi="Arial"/>
-                <w:color w:val="1D2730"/>
-                <w:sz w:val="17"/>
-              </w:rPr>
-              <w:t xml:space="preserve">La persona tiene un </w:t>
-            </w:r>
-            <w:r>
-              <w:rPr>
-                <w:rFonts w:ascii="Arial" w:hAnsi="Arial"/>
-                <w:color w:val="1D2730"/>
-                <w:sz w:val="17"/>
-              </w:rPr>
-              <w:t>rol_base</w:t>
-            </w:r>
-            <w:r>
-              <w:rPr>
-                <w:rFonts w:ascii="Arial" w:hAnsi="Arial"/>
-                <w:color w:val="1D2730"/>
-                <w:sz w:val="17"/>
-              </w:rPr>
-              <w:t>; no hay roles administrativos ni permisos separados.</w:t>
-            </w:r>
-          </w:p>
-        </w:tc>
-        <w:tc>
-          <w:tcPr>
-            <w:tcW w:type="dxa" w:w="3672"/>
-            <w:vAlign w:val="center"/>
-            <w:tcMar>
-              <w:top w:w="110" w:type="dxa"/>
-              <w:start w:w="110" w:type="dxa"/>
-              <w:bottom w:w="110" w:type="dxa"/>
-              <w:end w:w="110" w:type="dxa"/>
-            </w:tcMar>
-          </w:tcPr>
-          <w:p>
-            <w:pPr>
-              <w:spacing w:after="20" w:line="247" w:lineRule="auto"/>
-            </w:pPr>
-            <w:r>
-              <w:rPr>
-                <w:rFonts w:ascii="Arial" w:hAnsi="Arial"/>
-                <w:color w:val="1D2730"/>
-                <w:sz w:val="17"/>
-              </w:rPr>
-              <w:t>Los permisos operativos no se pueden asignar de forma granular.</w:t>
-            </w:r>
-          </w:p>
-        </w:tc>
-        <w:tc>
-          <w:tcPr>
-            <w:tcW w:type="dxa" w:w="4118"/>
-            <w:vAlign w:val="center"/>
-            <w:tcMar>
-              <w:top w:w="110" w:type="dxa"/>
-              <w:start w:w="110" w:type="dxa"/>
-              <w:bottom w:w="110" w:type="dxa"/>
-              <w:end w:w="110" w:type="dxa"/>
-            </w:tcMar>
-          </w:tcPr>
-          <w:p>
-            <w:pPr>
-              <w:spacing w:after="20" w:line="247" w:lineRule="auto"/>
-            </w:pPr>
-            <w:r>
-              <w:rPr>
-                <w:rFonts w:ascii="Arial" w:hAnsi="Arial"/>
-                <w:color w:val="1D2730"/>
-                <w:sz w:val="17"/>
-              </w:rPr>
-              <w:t>Definir autorización por rol y atribuciones administrativas dentro de BC-01.</w:t>
-            </w:r>
-          </w:p>
-        </w:tc>
-      </w:tr>
-      <w:tr>
-        <w:trPr>
-          <w:cantSplit/>
-        </w:trPr>
-        <w:tc>
-          <w:tcPr>
-            <w:tcW w:type="dxa" w:w="2088"/>
-            <w:vAlign w:val="center"/>
-            <w:tcMar>
-              <w:top w:w="110" w:type="dxa"/>
-              <w:start w:w="110" w:type="dxa"/>
-              <w:bottom w:w="110" w:type="dxa"/>
-              <w:end w:w="110" w:type="dxa"/>
-            </w:tcMar>
-            <w:shd w:fill="EAF1F7"/>
-          </w:tcPr>
-          <w:p>
-            <w:pPr>
-              <w:spacing w:after="20" w:line="247" w:lineRule="auto"/>
-            </w:pPr>
-            <w:r>
-              <w:rPr>
-                <w:rFonts w:ascii="Arial" w:hAnsi="Arial"/>
-                <w:color w:val="1D2730"/>
-                <w:sz w:val="17"/>
-              </w:rPr>
-              <w:t>No aparece el contexto de auditoría ni vínculo académico.</w:t>
-            </w:r>
-          </w:p>
-        </w:tc>
-        <w:tc>
-          <w:tcPr>
-            <w:tcW w:type="dxa" w:w="3672"/>
-            <w:vAlign w:val="center"/>
-            <w:tcMar>
-              <w:top w:w="110" w:type="dxa"/>
-              <w:start w:w="110" w:type="dxa"/>
-              <w:bottom w:w="110" w:type="dxa"/>
-              <w:end w:w="110" w:type="dxa"/>
-            </w:tcMar>
-            <w:shd w:fill="EAF1F7"/>
-          </w:tcPr>
-          <w:p>
-            <w:pPr>
-              <w:spacing w:after="20" w:line="247" w:lineRule="auto"/>
-            </w:pPr>
-            <w:r>
-              <w:rPr>
-                <w:rFonts w:ascii="Arial" w:hAnsi="Arial"/>
-                <w:color w:val="1D2730"/>
-                <w:sz w:val="17"/>
-              </w:rPr>
-              <w:t>No se reconstruyen cambios ni se valida elegibilidad académica con el esquema actual.</w:t>
-            </w:r>
-          </w:p>
-        </w:tc>
-        <w:tc>
-          <w:tcPr>
-            <w:tcW w:type="dxa" w:w="4118"/>
-            <w:vAlign w:val="center"/>
-            <w:tcMar>
-              <w:top w:w="110" w:type="dxa"/>
-              <w:start w:w="110" w:type="dxa"/>
-              <w:bottom w:w="110" w:type="dxa"/>
-              <w:end w:w="110" w:type="dxa"/>
-            </w:tcMar>
-            <w:shd w:fill="EAF1F7"/>
-          </w:tcPr>
-          <w:p>
-            <w:pPr>
-              <w:spacing w:after="20" w:line="247" w:lineRule="auto"/>
-            </w:pPr>
-            <w:r>
-              <w:rPr>
-                <w:rFonts w:ascii="Arial" w:hAnsi="Arial"/>
-                <w:color w:val="1D2730"/>
-                <w:sz w:val="17"/>
-              </w:rPr>
-              <w:t>Diseñar esos contextos y definir fuente institucional de datos antes de producción.</w:t>
-            </w:r>
-          </w:p>
-        </w:tc>
-      </w:tr>
-    </w:tbl>
-    <w:p>
-      <w:pPr>
-        <w:spacing w:after="40"/>
-      </w:pPr>
-    </w:p>
-    <w:p>
-      <w:pPr>
-        <w:pStyle w:val="Heading2"/>
-      </w:pPr>
-      <w:r>
-        <w:rPr>
-          <w:rFonts w:ascii="Arial" w:hAnsi="Arial"/>
-        </w:rPr>
-        <w:t>Avance y siguiente etapa</w:t>
+        <w:t>El dominio y el SQL ofrecen una base para iniciar identidad, catálogo e inventario, reservas y préstamos. Antes de convertir el esquema en migraciones, deben cerrarse las reglas de préstamo activo, el momento de entrega, las políticas y la relación reserva-préstamo. La siguiente entrega técnica debería integrar SQLAlchemy y Alembic, implementar primero identidad e inventario y probar la disponibilidad transaccional.</w:t>
       </w:r>
     </w:p>
     <w:p>
@@ -4014,131 +2424,15 @@
       <w:r>
         <w:rPr>
           <w:rFonts w:ascii="Arial" w:hAnsi="Arial"/>
+          <w:b/>
         </w:rPr>
-        <w:t>El trabajo existente es una base de documentación y entorno. El repositorio contiene una API mínima de salud, el servicio local de PostgreSQL y la propuesta de tecnologías. El SQL adjunto es un insumo de diseño externo al repositorio; todavía no existe una migración ni una implementación funcional de las tablas [F4].</w:t>
+        <w:t>Estado actual:</w:t>
       </w:r>
-    </w:p>
-    <w:p>
-      <w:pPr>
-        <w:widowControl/>
-        <w:jc w:val="left"/>
-      </w:pPr>
       <w:r>
         <w:rPr>
           <w:rFonts w:ascii="Arial" w:hAnsi="Arial"/>
         </w:rPr>
-        <w:t>La siguiente etapa debe integrar la configuración de base de datos y Alembic, después modelar identidad y catálogo, proteger las operaciones de inventario y añadir pruebas. Reservas y préstamos se implementarán cuando la autenticación y la disponibilidad de unidades ya tengan un flujo consistente. Este orden sigue el incremento inicial planificado en el proyecto [F4].</w:t>
-      </w:r>
-    </w:p>
-    <w:p>
-      <w:pPr>
-        <w:pStyle w:val="Heading2"/>
-      </w:pPr>
-      <w:r>
-        <w:rPr>
-          <w:rFonts w:ascii="Arial" w:hAnsi="Arial"/>
-        </w:rPr>
-        <w:t>Conclusiones</w:t>
-      </w:r>
-    </w:p>
-    <w:p>
-      <w:pPr>
-        <w:widowControl/>
-        <w:jc w:val="left"/>
-      </w:pPr>
-      <w:r>
-        <w:rPr>
-          <w:rFonts w:ascii="Arial" w:hAnsi="Arial"/>
-        </w:rPr>
-        <w:t>El examen presenta un diseño que conecta requisitos, dominio y arquitectura. El esquema ya precisa las entidades principales para registrar personas, bienes, unidades, reservas, préstamos y renovaciones. La arquitectura en capas propuesta permite trasladar esos conceptos a Python manteniendo las reglas separadas de la API y de PostgreSQL.</w:t>
-      </w:r>
-    </w:p>
-    <w:p>
-      <w:pPr>
-        <w:widowControl/>
-        <w:jc w:val="left"/>
-      </w:pPr>
-      <w:r>
-        <w:rPr>
-          <w:rFonts w:ascii="Arial" w:hAnsi="Arial"/>
-        </w:rPr>
-        <w:t>El siguiente paso técnico es integrar el SQL mediante migraciones y revisar las invariantes de préstamo activo, ciclo de entrega y política aplicada. Las reglas de roles, elegibilidad académica, auditoría y operación deben validarse con la EPCC antes de considerarlas cerradas.</w:t>
-      </w:r>
-    </w:p>
-    <w:p>
-      <w:r>
-        <w:br w:type="page"/>
-      </w:r>
-    </w:p>
-    <w:p>
-      <w:pPr>
-        <w:pStyle w:val="Heading2"/>
-      </w:pPr>
-      <w:r>
-        <w:rPr>
-          <w:rFonts w:ascii="Arial" w:hAnsi="Arial"/>
-        </w:rPr>
-        <w:t>Guion breve para la exposición</w:t>
-      </w:r>
-    </w:p>
-    <w:p>
-      <w:pPr>
-        <w:pStyle w:val="ListNumber"/>
-        <w:spacing w:after="60"/>
-      </w:pPr>
-      <w:r>
-        <w:rPr>
-          <w:rFonts w:ascii="Arial" w:hAnsi="Arial"/>
-        </w:rPr>
-        <w:t>Presentar el problema: controlar qué unidad se presta, a quién, por cuánto tiempo y en qué condición se devuelve.</w:t>
-      </w:r>
-    </w:p>
-    <w:p>
-      <w:pPr>
-        <w:pStyle w:val="ListNumber"/>
-        <w:spacing w:after="60"/>
-      </w:pPr>
-      <w:r>
-        <w:rPr>
-          <w:rFonts w:ascii="Arial" w:hAnsi="Arial"/>
-        </w:rPr>
-        <w:t>Explicar los requisitos funcionales y las cualidades esperadas de consistencia, seguridad y trazabilidad.</w:t>
-      </w:r>
-    </w:p>
-    <w:p>
-      <w:pPr>
-        <w:pStyle w:val="ListNumber"/>
-        <w:spacing w:after="60"/>
-      </w:pPr>
-      <w:r>
-        <w:rPr>
-          <w:rFonts w:ascii="Arial" w:hAnsi="Arial"/>
-        </w:rPr>
-        <w:t>Recorrer el modelo: Persona y Cuenta; jerarquía del inventario; Reserva; Préstamo y Renovación.</w:t>
-      </w:r>
-    </w:p>
-    <w:p>
-      <w:pPr>
-        <w:pStyle w:val="ListNumber"/>
-        <w:spacing w:after="60"/>
-      </w:pPr>
-      <w:r>
-        <w:rPr>
-          <w:rFonts w:ascii="Arial" w:hAnsi="Arial"/>
-        </w:rPr>
-        <w:t>Mostrar cómo la arquitectura separa API, casos de uso, dominio e infraestructura.</w:t>
-      </w:r>
-    </w:p>
-    <w:p>
-      <w:pPr>
-        <w:pStyle w:val="ListNumber"/>
-        <w:spacing w:after="60"/>
-      </w:pPr>
-      <w:r>
-        <w:rPr>
-          <w:rFonts w:ascii="Arial" w:hAnsi="Arial"/>
-        </w:rPr>
-        <w:t>Cerrar con el avance real y las decisiones pendientes antes de implementar préstamos.</w:t>
+        <w:t xml:space="preserve"> documentación inicial, API mínima de salud y PostgreSQL local. No están implementados los modelos de persistencia, autenticación ni los casos de uso del negocio.</w:t>
       </w:r>
     </w:p>
     <w:p>
@@ -4154,39 +2448,47 @@
     </w:p>
     <w:p>
       <w:pPr>
-        <w:pStyle w:val="ListBullet"/>
+        <w:pStyle w:val="ListNumber"/>
         <w:spacing w:after="60"/>
       </w:pPr>
       <w:r>
         <w:rPr>
           <w:rFonts w:ascii="Arial" w:hAnsi="Arial"/>
         </w:rPr>
-        <w:t>[F1] Pauta del primer examen compartida por el usuario. Solicita requisitos, modelo de dominio y arquitectura en capas con diagramas UML de paquetes y clases.</w:t>
+        <w:t>Pauta del primer examen compartida por el usuario: requisitos, modelo de dominio y arquitectura en capas con diagramas UML.</w:t>
       </w:r>
     </w:p>
     <w:p>
       <w:pPr>
-        <w:pStyle w:val="ListBullet"/>
+        <w:pStyle w:val="ListNumber"/>
         <w:spacing w:after="60"/>
       </w:pPr>
       <w:r>
         <w:rPr>
           <w:rFonts w:ascii="Arial" w:hAnsi="Arial"/>
         </w:rPr>
-        <w:t>[F2] Diagrama de clases del modelo de dominio del Sistema de Gestión de Préstamos de Bienes EPCC UNSA compartido previamente en el proyecto.</w:t>
+        <w:t xml:space="preserve">Diagrama conceptual </w:t>
+      </w:r>
+      <w:r>
+        <w:rPr>
+          <w:rFonts w:ascii="Menlo" w:hAnsi="Menlo"/>
+          <w:color w:val="245B84"/>
+          <w:sz w:val="18"/>
+        </w:rPr>
+        <w:t>modelo-de-dominio_blan2 (1).png</w:t>
+      </w:r>
+      <w:r>
+        <w:rPr>
+          <w:rFonts w:ascii="Arial" w:hAnsi="Arial"/>
+        </w:rPr>
+        <w:t>, proporcionado para esta revisión.</w:t>
       </w:r>
     </w:p>
     <w:p>
       <w:pPr>
-        <w:pStyle w:val="ListBullet"/>
+        <w:pStyle w:val="ListNumber"/>
         <w:spacing w:after="60"/>
       </w:pPr>
-      <w:r>
-        <w:rPr>
-          <w:rFonts w:ascii="Arial" w:hAnsi="Arial"/>
-        </w:rPr>
-        <w:t xml:space="preserve">[F3] </w:t>
-      </w:r>
       <w:r>
         <w:rPr>
           <w:rFonts w:ascii="Menlo" w:hAnsi="Menlo"/>
@@ -4199,19 +2501,19 @@
         <w:rPr>
           <w:rFonts w:ascii="Arial" w:hAnsi="Arial"/>
         </w:rPr>
-        <w:t>, esquema PostgreSQL derivado del modelo de dominio v6/v7; el encabezado declara cobertura parcial de BC-01 y cobertura de BC-03, BC-05 y BC-06.</w:t>
+        <w:t>, esquema PostgreSQL derivado del modelo de dominio v6/v7.</w:t>
       </w:r>
     </w:p>
     <w:p>
       <w:pPr>
-        <w:pStyle w:val="ListBullet"/>
+        <w:pStyle w:val="ListNumber"/>
         <w:spacing w:after="60"/>
       </w:pPr>
       <w:r>
         <w:rPr>
           <w:rFonts w:ascii="Arial" w:hAnsi="Arial"/>
         </w:rPr>
-        <w:t>[F4] Repositorio Sistema_Prestamos_EPCC, documentación de visión, arquitectura, dominio y plan de implementación; estado revisado al 29 de septiembre de 2026.</w:t>
+        <w:t>Documentación del repositorio: visión, arquitectura, modelo de dominio y plan de implementación; estado revisado el 29 de septiembre de 2026.</w:t>
       </w:r>
     </w:p>
     <w:sectPr>
@@ -5075,7 +3377,7 @@
     <w:rsid w:val="00FC693F"/>
     <w:pPr>
       <w:keepNext/>
-      <w:spacing w:after="360" w:line="240" w:lineRule="auto" w:before="1440"/>
+      <w:spacing w:after="160" w:line="240" w:lineRule="auto" w:before="0"/>
       <w:contextualSpacing/>
     </w:pPr>
     <w:rPr>
@@ -5084,7 +3386,7 @@
       <w:color w:val="000000"/>
       <w:spacing w:val="5"/>
       <w:kern w:val="28"/>
-      <w:sz w:val="54"/>
+      <w:sz w:val="42"/>
       <w:szCs w:val="52"/>
     </w:rPr>
   </w:style>

</xml_diff>